<commit_message>
Refactorizando y agregando generacion por LLM
</commit_message>
<xml_diff>
--- a/templates/InformePruebaV4.docx
+++ b/templates/InformePruebaV4.docx
@@ -1128,9 +1128,6 @@
       </w:r>
     </w:p>
     <w:p>
-      <w:pPr>
-        <w:jc w:val="both"/>
-      </w:pPr>
       <w:r>
         <w:t>El presente informe tiene como objetivo proporcionar una visión analítica y detallada del desempeño académico en la titulación de</w:t>
       </w:r>
@@ -1191,9 +1188,6 @@
       </w:r>
     </w:p>
     <w:p>
-      <w:pPr>
-        <w:jc w:val="both"/>
-      </w:pPr>
       <w:r>
         <w:t>Para facilitar la interpretación de los datos, los resultados se presentan de manera estructurada mediante una serie de visualizaciones gráficas y análisis exhaustivos organizados bajo los siguientes criterios:</w:t>
       </w:r>
@@ -1205,7 +1199,6 @@
           <w:ilvl w:val="0"/>
           <w:numId w:val="5"/>
         </w:numPr>
-        <w:jc w:val="both"/>
       </w:pPr>
       <w:r>
         <w:rPr>
@@ -1225,7 +1218,6 @@
           <w:ilvl w:val="0"/>
           <w:numId w:val="5"/>
         </w:numPr>
-        <w:jc w:val="both"/>
       </w:pPr>
       <w:r>
         <w:rPr>
@@ -1245,7 +1237,6 @@
           <w:ilvl w:val="0"/>
           <w:numId w:val="5"/>
         </w:numPr>
-        <w:jc w:val="both"/>
       </w:pPr>
       <w:r>
         <w:rPr>
@@ -1265,7 +1256,6 @@
           <w:ilvl w:val="0"/>
           <w:numId w:val="5"/>
         </w:numPr>
-        <w:jc w:val="both"/>
       </w:pPr>
       <w:r>
         <w:rPr>
@@ -1285,16 +1275,58 @@
     </w:p>
     <w:p/>
     <w:p>
-      <w:r>
-        <w:t xml:space="preserve">{%p </w:t>
+      <w:pPr>
+        <w:rPr>
+          <w:lang w:val="en-US"/>
+        </w:rPr>
+      </w:pPr>
+      <w:r>
+        <w:rPr>
+          <w:lang w:val="en-US"/>
+        </w:rPr>
+        <w:t xml:space="preserve">{%p for </w:t>
       </w:r>
       <w:proofErr w:type="spellStart"/>
       <w:r>
-        <w:t>for</w:t>
+        <w:rPr>
+          <w:lang w:val="en-US"/>
+        </w:rPr>
+        <w:t>curso</w:t>
       </w:r>
       <w:proofErr w:type="spellEnd"/>
       <w:r>
-        <w:t xml:space="preserve"> curso in datos %}</w:t>
+        <w:rPr>
+          <w:lang w:val="en-US"/>
+        </w:rPr>
+        <w:t xml:space="preserve"> in </w:t>
+      </w:r>
+      <w:proofErr w:type="spellStart"/>
+      <w:r>
+        <w:rPr>
+          <w:lang w:val="en-US"/>
+        </w:rPr>
+        <w:t>breakdown_</w:t>
+      </w:r>
+      <w:proofErr w:type="gramStart"/>
+      <w:r>
+        <w:rPr>
+          <w:lang w:val="en-US"/>
+        </w:rPr>
+        <w:t>data</w:t>
+      </w:r>
+      <w:r>
+        <w:rPr>
+          <w:lang w:val="en-US"/>
+        </w:rPr>
+        <w:t>.breakdown</w:t>
+      </w:r>
+      <w:proofErr w:type="spellEnd"/>
+      <w:proofErr w:type="gramEnd"/>
+      <w:r>
+        <w:rPr>
+          <w:lang w:val="en-US"/>
+        </w:rPr>
+        <w:t xml:space="preserve"> %}</w:t>
       </w:r>
     </w:p>
     <w:p>
@@ -1307,27 +1339,14 @@
       </w:r>
       <w:proofErr w:type="gramStart"/>
       <w:r>
-        <w:t xml:space="preserve">{{ </w:t>
-      </w:r>
-      <w:proofErr w:type="spellStart"/>
-      <w:r>
-        <w:t>curso</w:t>
+        <w:t>{{ curso.</w:t>
+      </w:r>
+      <w:r>
+        <w:t>name</w:t>
       </w:r>
       <w:proofErr w:type="gramEnd"/>
       <w:r>
-        <w:t>.</w:t>
-      </w:r>
-      <w:proofErr w:type="gramStart"/>
-      <w:r>
-        <w:t>nombre</w:t>
-      </w:r>
-      <w:proofErr w:type="spellEnd"/>
-      <w:r>
-        <w:t xml:space="preserve"> }</w:t>
-      </w:r>
-      <w:proofErr w:type="gramEnd"/>
-      <w:r>
-        <w:t>}</w:t>
+        <w:t xml:space="preserve"> }}</w:t>
       </w:r>
       <w:bookmarkEnd w:id="6"/>
     </w:p>
@@ -1363,7 +1382,13 @@
         <w:rPr>
           <w:lang w:val="en-US"/>
         </w:rPr>
-        <w:t>curso.tasas</w:t>
+        <w:t>curso.</w:t>
+      </w:r>
+      <w:r>
+        <w:rPr>
+          <w:lang w:val="en-US"/>
+        </w:rPr>
+        <w:t>rate</w:t>
       </w:r>
       <w:proofErr w:type="spellEnd"/>
       <w:proofErr w:type="gramEnd"/>
@@ -1371,7 +1396,13 @@
         <w:rPr>
           <w:lang w:val="en-US"/>
         </w:rPr>
-        <w:t xml:space="preserve"> %}</w:t>
+        <w:t xml:space="preserve"> </w:t>
+      </w:r>
+      <w:r>
+        <w:rPr>
+          <w:lang w:val="en-US"/>
+        </w:rPr>
+        <w:t>%}</w:t>
       </w:r>
     </w:p>
     <w:p>
@@ -1392,7 +1423,13 @@
         <w:rPr>
           <w:lang w:val="en-US"/>
         </w:rPr>
-        <w:t>tasa.cuatrimestres</w:t>
+        <w:t>tasa.</w:t>
+      </w:r>
+      <w:r>
+        <w:rPr>
+          <w:lang w:val="en-US"/>
+        </w:rPr>
+        <w:t>quarters</w:t>
       </w:r>
       <w:proofErr w:type="spellEnd"/>
       <w:proofErr w:type="gramEnd"/>
@@ -1410,11 +1447,97 @@
           <w:lang w:val="en-US"/>
         </w:rPr>
       </w:pPr>
+      <w:proofErr w:type="spellStart"/>
+      <w:r>
+        <w:rPr>
+          <w:lang w:val="en-US"/>
+        </w:rPr>
+        <w:t>Cuatrimestre</w:t>
+      </w:r>
+      <w:proofErr w:type="spellEnd"/>
+      <w:r>
+        <w:rPr>
+          <w:lang w:val="en-US"/>
+        </w:rPr>
+        <w:t xml:space="preserve">: </w:t>
+      </w:r>
       <w:proofErr w:type="gramStart"/>
       <w:r>
         <w:rPr>
           <w:lang w:val="en-US"/>
         </w:rPr>
+        <w:t>{{</w:t>
+      </w:r>
+      <w:r>
+        <w:rPr>
+          <w:lang w:val="en-US"/>
+        </w:rPr>
+        <w:t xml:space="preserve"> </w:t>
+      </w:r>
+      <w:r>
+        <w:rPr>
+          <w:lang w:val="en-US"/>
+        </w:rPr>
+        <w:t>item.name</w:t>
+      </w:r>
+      <w:proofErr w:type="gramEnd"/>
+      <w:r>
+        <w:rPr>
+          <w:lang w:val="en-US"/>
+        </w:rPr>
+        <w:t xml:space="preserve"> }}</w:t>
+      </w:r>
+      <w:r>
+        <w:rPr>
+          <w:lang w:val="en-US"/>
+        </w:rPr>
+        <w:t xml:space="preserve"> - </w:t>
+      </w:r>
+      <w:r>
+        <w:rPr>
+          <w:lang w:val="en-US"/>
+        </w:rPr>
+        <w:t xml:space="preserve">Tasa de </w:t>
+      </w:r>
+      <w:proofErr w:type="gramStart"/>
+      <w:r>
+        <w:rPr>
+          <w:lang w:val="en-US"/>
+        </w:rPr>
+        <w:t>{{ tasa.name</w:t>
+      </w:r>
+      <w:proofErr w:type="gramEnd"/>
+      <w:r>
+        <w:rPr>
+          <w:lang w:val="en-US"/>
+        </w:rPr>
+        <w:t xml:space="preserve"> }}</w:t>
+      </w:r>
+      <w:r>
+        <w:rPr>
+          <w:lang w:val="en-US"/>
+        </w:rPr>
+        <w:t xml:space="preserve"> – </w:t>
+      </w:r>
+      <w:proofErr w:type="spellStart"/>
+      <w:r>
+        <w:rPr>
+          <w:lang w:val="en-US"/>
+        </w:rPr>
+        <w:t>Itinerario</w:t>
+      </w:r>
+      <w:proofErr w:type="spellEnd"/>
+      <w:r>
+        <w:rPr>
+          <w:lang w:val="en-US"/>
+        </w:rPr>
+        <w:t xml:space="preserve">: </w:t>
+      </w:r>
+      <w:proofErr w:type="gramStart"/>
+      <w:r>
+        <w:rPr>
+          <w:lang w:val="en-US"/>
+        </w:rPr>
         <w:t xml:space="preserve">{{ </w:t>
       </w:r>
       <w:proofErr w:type="spellStart"/>
@@ -1429,343 +1552,132 @@
         <w:rPr>
           <w:lang w:val="en-US"/>
         </w:rPr>
-        <w:t>.curso</w:t>
+        <w:t>.</w:t>
+      </w:r>
+      <w:proofErr w:type="gramStart"/>
+      <w:r>
+        <w:rPr>
+          <w:lang w:val="en-US"/>
+        </w:rPr>
+        <w:t>itinerary</w:t>
       </w:r>
       <w:proofErr w:type="spellEnd"/>
       <w:r>
         <w:rPr>
           <w:lang w:val="en-US"/>
         </w:rPr>
-        <w:t xml:space="preserve">}} – </w:t>
-      </w:r>
+        <w:t xml:space="preserve"> }</w:t>
+      </w:r>
+      <w:proofErr w:type="gramEnd"/>
+      <w:r>
+        <w:rPr>
+          <w:lang w:val="en-US"/>
+        </w:rPr>
+        <w:t>}</w:t>
+      </w:r>
+    </w:p>
+    <w:p>
+      <w:pPr>
+        <w:jc w:val="center"/>
+      </w:pPr>
       <w:proofErr w:type="gramStart"/>
       <w:r>
-        <w:rPr>
-          <w:lang w:val="en-US"/>
-        </w:rPr>
         <w:t xml:space="preserve">{{ </w:t>
       </w:r>
       <w:proofErr w:type="spellStart"/>
       <w:r>
-        <w:rPr>
-          <w:lang w:val="en-US"/>
-        </w:rPr>
         <w:t>item</w:t>
       </w:r>
       <w:proofErr w:type="gramEnd"/>
       <w:r>
-        <w:rPr>
-          <w:lang w:val="en-US"/>
-        </w:rPr>
         <w:t>.</w:t>
       </w:r>
       <w:proofErr w:type="gramStart"/>
       <w:r>
-        <w:rPr>
-          <w:lang w:val="en-US"/>
-        </w:rPr>
-        <w:t>tasa</w:t>
+        <w:t>chart</w:t>
       </w:r>
       <w:proofErr w:type="spellEnd"/>
       <w:r>
-        <w:rPr>
-          <w:lang w:val="en-US"/>
-        </w:rPr>
         <w:t xml:space="preserve"> }</w:t>
       </w:r>
       <w:proofErr w:type="gramEnd"/>
       <w:r>
-        <w:rPr>
-          <w:lang w:val="en-US"/>
-        </w:rPr>
-        <w:t xml:space="preserve">} - </w:t>
-      </w:r>
+        <w:t>}</w:t>
+      </w:r>
+    </w:p>
+    <w:p>
+      <w:pPr>
+        <w:rPr>
+          <w:lang w:val="en-US"/>
+        </w:rPr>
+      </w:pPr>
+      <w:r>
+        <w:rPr>
+          <w:lang w:val="en-US"/>
+        </w:rPr>
+        <w:t xml:space="preserve">{%p </w:t>
+      </w:r>
+      <w:proofErr w:type="spellStart"/>
+      <w:r>
+        <w:rPr>
+          <w:lang w:val="en-US"/>
+        </w:rPr>
+        <w:t>endfor</w:t>
+      </w:r>
+      <w:proofErr w:type="spellEnd"/>
+      <w:r>
+        <w:rPr>
+          <w:lang w:val="en-US"/>
+        </w:rPr>
+        <w:t xml:space="preserve"> %}</w:t>
+      </w:r>
+    </w:p>
+    <w:p>
+      <w:pPr>
+        <w:rPr>
+          <w:lang w:val="en-US"/>
+        </w:rPr>
+      </w:pPr>
+      <w:r>
+        <w:rPr>
+          <w:lang w:val="en-US"/>
+        </w:rPr>
+        <w:t xml:space="preserve">{%p </w:t>
+      </w:r>
+      <w:proofErr w:type="spellStart"/>
+      <w:r>
+        <w:rPr>
+          <w:lang w:val="en-US"/>
+        </w:rPr>
+        <w:t>endfor</w:t>
+      </w:r>
+      <w:proofErr w:type="spellEnd"/>
+      <w:r>
+        <w:rPr>
+          <w:lang w:val="en-US"/>
+        </w:rPr>
+        <w:t xml:space="preserve"> %}</w:t>
+      </w:r>
+    </w:p>
+    <w:p>
+      <w:pPr>
+        <w:rPr>
+          <w:lang w:val="en-US"/>
+        </w:rPr>
+      </w:pPr>
+      <w:r>
+        <w:rPr>
+          <w:lang w:val="en-US"/>
+        </w:rPr>
+        <w:t xml:space="preserve">{%p if not </w:t>
+      </w:r>
+      <w:proofErr w:type="spellStart"/>
       <w:proofErr w:type="gramStart"/>
       <w:r>
         <w:rPr>
           <w:lang w:val="en-US"/>
         </w:rPr>
-        <w:t xml:space="preserve">{{ </w:t>
-      </w:r>
-      <w:proofErr w:type="spellStart"/>
-      <w:r>
-        <w:rPr>
-          <w:lang w:val="en-US"/>
-        </w:rPr>
-        <w:t>item</w:t>
-      </w:r>
-      <w:proofErr w:type="gramEnd"/>
-      <w:r>
-        <w:rPr>
-          <w:lang w:val="en-US"/>
-        </w:rPr>
-        <w:t>.cuat_</w:t>
-      </w:r>
-      <w:proofErr w:type="gramStart"/>
-      <w:r>
-        <w:rPr>
-          <w:lang w:val="en-US"/>
-        </w:rPr>
-        <w:t>nombre</w:t>
-      </w:r>
-      <w:proofErr w:type="spellEnd"/>
-      <w:r>
-        <w:rPr>
-          <w:lang w:val="en-US"/>
-        </w:rPr>
-        <w:t xml:space="preserve"> }</w:t>
-      </w:r>
-      <w:proofErr w:type="gramEnd"/>
-      <w:r>
-        <w:rPr>
-          <w:lang w:val="en-US"/>
-        </w:rPr>
-        <w:t xml:space="preserve">} - </w:t>
-      </w:r>
-      <w:proofErr w:type="spellStart"/>
-      <w:r>
-        <w:rPr>
-          <w:lang w:val="en-US"/>
-        </w:rPr>
-        <w:t>Itinerario</w:t>
-      </w:r>
-      <w:proofErr w:type="spellEnd"/>
-      <w:r>
-        <w:rPr>
-          <w:lang w:val="en-US"/>
-        </w:rPr>
-        <w:t xml:space="preserve">: </w:t>
-      </w:r>
-      <w:proofErr w:type="gramStart"/>
-      <w:r>
-        <w:rPr>
-          <w:lang w:val="en-US"/>
-        </w:rPr>
-        <w:t xml:space="preserve">{{ </w:t>
-      </w:r>
-      <w:proofErr w:type="spellStart"/>
-      <w:r>
-        <w:rPr>
-          <w:lang w:val="en-US"/>
-        </w:rPr>
-        <w:t>item</w:t>
-      </w:r>
-      <w:proofErr w:type="gramEnd"/>
-      <w:r>
-        <w:rPr>
-          <w:lang w:val="en-US"/>
-        </w:rPr>
-        <w:t>.</w:t>
-      </w:r>
-      <w:proofErr w:type="gramStart"/>
-      <w:r>
-        <w:rPr>
-          <w:lang w:val="en-US"/>
-        </w:rPr>
-        <w:t>itinerario</w:t>
-      </w:r>
-      <w:proofErr w:type="spellEnd"/>
-      <w:r>
-        <w:rPr>
-          <w:lang w:val="en-US"/>
-        </w:rPr>
-        <w:t xml:space="preserve"> }</w:t>
-      </w:r>
-      <w:proofErr w:type="gramEnd"/>
-      <w:r>
-        <w:rPr>
-          <w:lang w:val="en-US"/>
-        </w:rPr>
-        <w:t>}</w:t>
-      </w:r>
-    </w:p>
-    <w:p>
-      <w:pPr>
-        <w:rPr>
-          <w:lang w:val="en-US"/>
-        </w:rPr>
-      </w:pPr>
-      <w:proofErr w:type="gramStart"/>
-      <w:r>
-        <w:rPr>
-          <w:lang w:val="en-US"/>
-        </w:rPr>
-        <w:t xml:space="preserve">{{ </w:t>
-      </w:r>
-      <w:proofErr w:type="spellStart"/>
-      <w:r>
-        <w:rPr>
-          <w:lang w:val="en-US"/>
-        </w:rPr>
-        <w:t>item</w:t>
-      </w:r>
-      <w:proofErr w:type="gramEnd"/>
-      <w:r>
-        <w:rPr>
-          <w:lang w:val="en-US"/>
-        </w:rPr>
-        <w:t>.</w:t>
-      </w:r>
-      <w:proofErr w:type="gramStart"/>
-      <w:r>
-        <w:rPr>
-          <w:lang w:val="en-US"/>
-        </w:rPr>
-        <w:t>grafica</w:t>
-      </w:r>
-      <w:proofErr w:type="spellEnd"/>
-      <w:r>
-        <w:rPr>
-          <w:lang w:val="en-US"/>
-        </w:rPr>
-        <w:t xml:space="preserve"> }</w:t>
-      </w:r>
-      <w:proofErr w:type="gramEnd"/>
-      <w:r>
-        <w:rPr>
-          <w:lang w:val="en-US"/>
-        </w:rPr>
-        <w:t>}</w:t>
-      </w:r>
-    </w:p>
-    <w:p>
-      <w:pPr>
-        <w:rPr>
-          <w:lang w:val="en-US"/>
-        </w:rPr>
-      </w:pPr>
-      <w:r>
-        <w:rPr>
-          <w:lang w:val="en-US"/>
-        </w:rPr>
-        <w:t xml:space="preserve">{%p </w:t>
-      </w:r>
-      <w:proofErr w:type="spellStart"/>
-      <w:r>
-        <w:rPr>
-          <w:lang w:val="en-US"/>
-        </w:rPr>
-        <w:t>endfor</w:t>
-      </w:r>
-      <w:proofErr w:type="spellEnd"/>
-      <w:r>
-        <w:rPr>
-          <w:lang w:val="en-US"/>
-        </w:rPr>
-        <w:t xml:space="preserve"> %}</w:t>
-      </w:r>
-    </w:p>
-    <w:p>
-      <w:pPr>
-        <w:rPr>
-          <w:lang w:val="en-US"/>
-        </w:rPr>
-      </w:pPr>
-      <w:r>
-        <w:rPr>
-          <w:lang w:val="en-US"/>
-        </w:rPr>
-        <w:t xml:space="preserve">{%p </w:t>
-      </w:r>
-      <w:proofErr w:type="spellStart"/>
-      <w:r>
-        <w:rPr>
-          <w:lang w:val="en-US"/>
-        </w:rPr>
-        <w:t>endfor</w:t>
-      </w:r>
-      <w:proofErr w:type="spellEnd"/>
-      <w:r>
-        <w:rPr>
-          <w:lang w:val="en-US"/>
-        </w:rPr>
-        <w:t xml:space="preserve"> %}</w:t>
-      </w:r>
-    </w:p>
-    <w:p>
-      <w:pPr>
-        <w:pStyle w:val="Ttulo3"/>
-        <w:rPr>
-          <w:lang w:val="en-US"/>
-        </w:rPr>
-      </w:pPr>
-      <w:proofErr w:type="spellStart"/>
-      <w:r>
-        <w:rPr>
-          <w:lang w:val="en-US"/>
-        </w:rPr>
-        <w:t>Resumen</w:t>
-      </w:r>
-      <w:proofErr w:type="spellEnd"/>
-      <w:r>
-        <w:rPr>
-          <w:lang w:val="en-US"/>
-        </w:rPr>
-        <w:t xml:space="preserve">: </w:t>
-      </w:r>
-      <w:proofErr w:type="gramStart"/>
-      <w:r>
-        <w:rPr>
-          <w:lang w:val="en-US"/>
-        </w:rPr>
-        <w:t xml:space="preserve">{{ </w:t>
-      </w:r>
-      <w:proofErr w:type="spellStart"/>
-      <w:r>
-        <w:rPr>
-          <w:lang w:val="en-US"/>
-        </w:rPr>
-        <w:t>curso</w:t>
-      </w:r>
-      <w:proofErr w:type="gramEnd"/>
-      <w:r>
-        <w:rPr>
-          <w:lang w:val="en-US"/>
-        </w:rPr>
-        <w:t>.</w:t>
-      </w:r>
-      <w:proofErr w:type="gramStart"/>
-      <w:r>
-        <w:rPr>
-          <w:lang w:val="en-US"/>
-        </w:rPr>
-        <w:t>nombre</w:t>
-      </w:r>
-      <w:proofErr w:type="spellEnd"/>
-      <w:r>
-        <w:rPr>
-          <w:lang w:val="en-US"/>
-        </w:rPr>
-        <w:t xml:space="preserve"> }</w:t>
-      </w:r>
-      <w:proofErr w:type="gramEnd"/>
-      <w:r>
-        <w:rPr>
-          <w:lang w:val="en-US"/>
-        </w:rPr>
-        <w:t>}</w:t>
-      </w:r>
-    </w:p>
-    <w:p>
-      <w:pPr>
-        <w:jc w:val="both"/>
-        <w:rPr>
-          <w:lang w:val="en-US"/>
-        </w:rPr>
-      </w:pPr>
-      <w:proofErr w:type="gramStart"/>
-      <w:r>
-        <w:rPr>
-          <w:lang w:val="en-US"/>
-        </w:rPr>
-        <w:t xml:space="preserve">{{ </w:t>
-      </w:r>
-      <w:proofErr w:type="spellStart"/>
-      <w:r>
-        <w:rPr>
-          <w:lang w:val="en-US"/>
-        </w:rPr>
-        <w:t>curso</w:t>
+        <w:t>loop.last</w:t>
       </w:r>
       <w:proofErr w:type="spellEnd"/>
       <w:proofErr w:type="gramEnd"/>
@@ -1773,21 +1685,150 @@
         <w:rPr>
           <w:lang w:val="en-US"/>
         </w:rPr>
-        <w:t xml:space="preserve">. </w:t>
+        <w:t xml:space="preserve"> %}</w:t>
+      </w:r>
+    </w:p>
+    <w:p>
+      <w:pPr>
+        <w:rPr>
+          <w:lang w:val="en-US"/>
+        </w:rPr>
+      </w:pPr>
+      <w:r>
+        <w:rPr>
+          <w:lang w:val="en-US"/>
+        </w:rPr>
+        <w:br w:type="page"/>
+      </w:r>
+    </w:p>
+    <w:p>
+      <w:pPr>
+        <w:rPr>
+          <w:lang w:val="en-US"/>
+        </w:rPr>
+      </w:pPr>
+    </w:p>
+    <w:p>
+      <w:pPr>
+        <w:rPr>
+          <w:lang w:val="en-US"/>
+        </w:rPr>
+      </w:pPr>
+      <w:r>
+        <w:rPr>
+          <w:lang w:val="en-US"/>
+        </w:rPr>
+        <w:t>{%p endif %}</w:t>
+      </w:r>
+    </w:p>
+    <w:p>
+      <w:pPr>
+        <w:rPr>
+          <w:lang w:val="en-US"/>
+        </w:rPr>
+      </w:pPr>
+      <w:r>
+        <w:rPr>
+          <w:lang w:val="en-US"/>
+        </w:rPr>
+        <w:t xml:space="preserve">{%p </w:t>
       </w:r>
       <w:proofErr w:type="spellStart"/>
       <w:r>
         <w:rPr>
           <w:lang w:val="en-US"/>
         </w:rPr>
-        <w:t>llm_</w:t>
-      </w:r>
+        <w:t>endfor</w:t>
+      </w:r>
+      <w:proofErr w:type="spellEnd"/>
+      <w:r>
+        <w:rPr>
+          <w:lang w:val="en-US"/>
+        </w:rPr>
+        <w:t xml:space="preserve"> %}</w:t>
+      </w:r>
+    </w:p>
+    <w:p>
+      <w:pPr>
+        <w:jc w:val="left"/>
+        <w:rPr>
+          <w:rFonts w:asciiTheme="majorHAnsi" w:eastAsiaTheme="majorEastAsia" w:hAnsiTheme="majorHAnsi" w:cstheme="majorBidi"/>
+          <w:b/>
+          <w:color w:val="000000" w:themeColor="text1"/>
+          <w:sz w:val="32"/>
+          <w:szCs w:val="32"/>
+        </w:rPr>
+      </w:pPr>
+      <w:r>
+        <w:br w:type="page"/>
+      </w:r>
+    </w:p>
+    <w:p>
+      <w:pPr>
+        <w:pStyle w:val="Ttulo2"/>
+      </w:pPr>
+      <w:r>
+        <w:lastRenderedPageBreak/>
+        <w:t>Resumen del desglose de asig</w:t>
+      </w:r>
+      <w:r>
+        <w:t>naturas</w:t>
+      </w:r>
+    </w:p>
+    <w:p>
+      <w:pPr>
+        <w:jc w:val="center"/>
+        <w:rPr>
+          <w:lang w:val="en-US"/>
+        </w:rPr>
+      </w:pPr>
       <w:proofErr w:type="gramStart"/>
       <w:r>
         <w:rPr>
           <w:lang w:val="en-US"/>
         </w:rPr>
-        <w:t>message</w:t>
+        <w:t xml:space="preserve">{{ </w:t>
+      </w:r>
+      <w:proofErr w:type="spellStart"/>
+      <w:r>
+        <w:rPr>
+          <w:lang w:val="en-US"/>
+        </w:rPr>
+        <w:t>breakdown</w:t>
+      </w:r>
+      <w:proofErr w:type="gramEnd"/>
+      <w:r>
+        <w:rPr>
+          <w:lang w:val="en-US"/>
+        </w:rPr>
+        <w:t>_</w:t>
+      </w:r>
+      <w:proofErr w:type="gramStart"/>
+      <w:r>
+        <w:rPr>
+          <w:lang w:val="en-US"/>
+        </w:rPr>
+        <w:t>data.</w:t>
+      </w:r>
+      <w:r>
+        <w:rPr>
+          <w:lang w:val="en-US"/>
+        </w:rPr>
+        <w:t>resume</w:t>
+      </w:r>
+      <w:proofErr w:type="gramEnd"/>
+      <w:r>
+        <w:rPr>
+          <w:lang w:val="en-US"/>
+        </w:rPr>
+        <w:t>_</w:t>
+      </w:r>
+      <w:proofErr w:type="gramStart"/>
+      <w:r>
+        <w:rPr>
+          <w:lang w:val="en-US"/>
+        </w:rPr>
+        <w:t>chart</w:t>
       </w:r>
       <w:proofErr w:type="spellEnd"/>
       <w:r>
@@ -1810,87 +1851,61 @@
           <w:lang w:val="en-US"/>
         </w:rPr>
       </w:pPr>
-      <w:r>
-        <w:rPr>
-          <w:lang w:val="en-US"/>
-        </w:rPr>
-        <w:t xml:space="preserve">{%p if not </w:t>
+      <w:proofErr w:type="gramStart"/>
+      <w:r>
+        <w:rPr>
+          <w:lang w:val="en-US"/>
+        </w:rPr>
+        <w:t xml:space="preserve">{{ </w:t>
       </w:r>
       <w:proofErr w:type="spellStart"/>
+      <w:r>
+        <w:rPr>
+          <w:lang w:val="en-US"/>
+        </w:rPr>
+        <w:t>breakdown</w:t>
+      </w:r>
+      <w:proofErr w:type="gramEnd"/>
+      <w:r>
+        <w:rPr>
+          <w:lang w:val="en-US"/>
+        </w:rPr>
+        <w:t>_</w:t>
+      </w:r>
       <w:proofErr w:type="gramStart"/>
       <w:r>
         <w:rPr>
           <w:lang w:val="en-US"/>
         </w:rPr>
-        <w:t>loop.last</w:t>
+        <w:t>data.resume</w:t>
+      </w:r>
+      <w:proofErr w:type="gramEnd"/>
+      <w:r>
+        <w:rPr>
+          <w:lang w:val="en-US"/>
+        </w:rPr>
+        <w:t>_</w:t>
+      </w:r>
+      <w:proofErr w:type="gramStart"/>
+      <w:r>
+        <w:rPr>
+          <w:lang w:val="en-US"/>
+        </w:rPr>
+        <w:t>text</w:t>
       </w:r>
       <w:proofErr w:type="spellEnd"/>
+      <w:r>
+        <w:rPr>
+          <w:lang w:val="en-US"/>
+        </w:rPr>
+        <w:t xml:space="preserve"> }</w:t>
+      </w:r>
       <w:proofErr w:type="gramEnd"/>
       <w:r>
         <w:rPr>
           <w:lang w:val="en-US"/>
         </w:rPr>
-        <w:t xml:space="preserve"> %}</w:t>
-      </w:r>
-    </w:p>
-    <w:p>
-      <w:pPr>
-        <w:rPr>
-          <w:lang w:val="en-US"/>
-        </w:rPr>
-      </w:pPr>
-      <w:r>
-        <w:rPr>
-          <w:lang w:val="en-US"/>
-        </w:rPr>
-        <w:br w:type="page"/>
-      </w:r>
-    </w:p>
-    <w:p>
-      <w:pPr>
-        <w:rPr>
-          <w:lang w:val="en-US"/>
-        </w:rPr>
-      </w:pPr>
-    </w:p>
-    <w:p>
-      <w:pPr>
-        <w:rPr>
-          <w:lang w:val="en-US"/>
-        </w:rPr>
-      </w:pPr>
-      <w:r>
-        <w:rPr>
-          <w:lang w:val="en-US"/>
-        </w:rPr>
-        <w:t>{%p endif %}</w:t>
-      </w:r>
-    </w:p>
-    <w:p>
-      <w:pPr>
-        <w:rPr>
-          <w:lang w:val="en-US"/>
-        </w:rPr>
-      </w:pPr>
-      <w:r>
-        <w:rPr>
-          <w:lang w:val="en-US"/>
-        </w:rPr>
-        <w:t xml:space="preserve">{%p </w:t>
-      </w:r>
-      <w:proofErr w:type="spellStart"/>
-      <w:r>
-        <w:rPr>
-          <w:lang w:val="en-US"/>
-        </w:rPr>
-        <w:t>endfor</w:t>
-      </w:r>
-      <w:proofErr w:type="spellEnd"/>
-      <w:r>
-        <w:rPr>
-          <w:lang w:val="en-US"/>
-        </w:rPr>
-        <w:t xml:space="preserve"> %}</w:t>
+        <w:t>}</w:t>
       </w:r>
     </w:p>
     <w:p>
@@ -1909,22 +1924,23 @@
     <w:p>
       <w:pPr>
         <w:jc w:val="center"/>
+        <w:rPr>
+          <w:i/>
+          <w:iCs/>
+          <w:color w:val="404040" w:themeColor="text1" w:themeTint="BF"/>
+          <w:sz w:val="36"/>
+          <w:szCs w:val="36"/>
+        </w:rPr>
+      </w:pPr>
+      <w:r>
         <w:rPr>
           <w:rStyle w:val="nfasissutil"/>
           <w:sz w:val="36"/>
           <w:szCs w:val="36"/>
         </w:rPr>
-      </w:pPr>
-      <w:r>
-        <w:rPr>
-          <w:rStyle w:val="nfasissutil"/>
-          <w:sz w:val="36"/>
-          <w:szCs w:val="36"/>
-        </w:rPr>
         <w:t>No aplica en este informe</w:t>
       </w:r>
     </w:p>
-    <w:p/>
     <w:p>
       <w:r>
         <w:t xml:space="preserve">{%p </w:t>
@@ -2038,9 +2054,6 @@
       </w:r>
     </w:p>
     <w:p>
-      <w:pPr>
-        <w:jc w:val="both"/>
-      </w:pPr>
       <w:r>
         <w:t xml:space="preserve">En esta sección se aborda el análisis diferencial del rendimiento académico centrado exclusivamente en los </w:t>
       </w:r>
@@ -2056,9 +2069,6 @@
       </w:r>
     </w:p>
     <w:p>
-      <w:pPr>
-        <w:jc w:val="both"/>
-      </w:pPr>
       <w:r>
         <w:t xml:space="preserve">A diferencia del análisis general, este apartado se focaliza de forma estricta en las materias que definen cada itinerario, omitiendo el resto de </w:t>
       </w:r>
@@ -2078,7 +2088,6 @@
           <w:ilvl w:val="0"/>
           <w:numId w:val="7"/>
         </w:numPr>
-        <w:jc w:val="both"/>
       </w:pPr>
       <w:r>
         <w:rPr>
@@ -2098,7 +2107,6 @@
           <w:ilvl w:val="0"/>
           <w:numId w:val="7"/>
         </w:numPr>
-        <w:jc w:val="both"/>
       </w:pPr>
       <w:r>
         <w:rPr>
@@ -2118,7 +2126,6 @@
           <w:ilvl w:val="0"/>
           <w:numId w:val="7"/>
         </w:numPr>
-        <w:jc w:val="both"/>
       </w:pPr>
       <w:r>
         <w:rPr>
@@ -2136,36 +2143,78 @@
         <w:br w:type="page"/>
       </w:r>
     </w:p>
-    <w:p>
-      <w:pPr>
-        <w:jc w:val="both"/>
-      </w:pPr>
-    </w:p>
-    <w:p>
-      <w:r>
-        <w:t xml:space="preserve">{%p </w:t>
+    <w:p/>
+    <w:p>
+      <w:pPr>
+        <w:rPr>
+          <w:lang w:val="en-US"/>
+        </w:rPr>
+      </w:pPr>
+      <w:r>
+        <w:rPr>
+          <w:lang w:val="en-US"/>
+        </w:rPr>
+        <w:t xml:space="preserve">{%p for </w:t>
       </w:r>
       <w:proofErr w:type="spellStart"/>
       <w:r>
-        <w:t>for</w:t>
+        <w:rPr>
+          <w:lang w:val="en-US"/>
+        </w:rPr>
+        <w:t>curso</w:t>
       </w:r>
       <w:proofErr w:type="spellEnd"/>
       <w:r>
+        <w:rPr>
+          <w:lang w:val="en-US"/>
+        </w:rPr>
+        <w:t xml:space="preserve"> in </w:t>
+      </w:r>
+      <w:proofErr w:type="spellStart"/>
+      <w:r>
+        <w:rPr>
+          <w:lang w:val="en-US"/>
+        </w:rPr>
+        <w:t>itinerar</w:t>
+      </w:r>
+      <w:r>
+        <w:rPr>
+          <w:lang w:val="en-US"/>
+        </w:rPr>
+        <w:t>ies</w:t>
+      </w:r>
+      <w:r>
+        <w:rPr>
+          <w:lang w:val="en-US"/>
+        </w:rPr>
+        <w:t>_</w:t>
+      </w:r>
+      <w:proofErr w:type="gramStart"/>
+      <w:r>
+        <w:rPr>
+          <w:lang w:val="en-US"/>
+        </w:rPr>
+        <w:t>data.</w:t>
+      </w:r>
+      <w:r>
+        <w:rPr>
+          <w:lang w:val="en-US"/>
+        </w:rPr>
+        <w:t>breakdown</w:t>
+      </w:r>
+      <w:proofErr w:type="spellEnd"/>
+      <w:proofErr w:type="gramEnd"/>
+      <w:r>
+        <w:rPr>
+          <w:lang w:val="en-US"/>
+        </w:rPr>
         <w:t xml:space="preserve"> </w:t>
       </w:r>
       <w:r>
-        <w:t>curso</w:t>
-      </w:r>
-      <w:r>
-        <w:t xml:space="preserve"> in </w:t>
-      </w:r>
-      <w:proofErr w:type="spellStart"/>
-      <w:r>
-        <w:t>datos_itinerario</w:t>
-      </w:r>
-      <w:proofErr w:type="spellEnd"/>
-      <w:r>
-        <w:t xml:space="preserve"> %}</w:t>
+        <w:rPr>
+          <w:lang w:val="en-US"/>
+        </w:rPr>
+        <w:t>%}</w:t>
       </w:r>
     </w:p>
     <w:p>
@@ -2177,27 +2226,14 @@
       </w:r>
       <w:proofErr w:type="gramStart"/>
       <w:r>
-        <w:t xml:space="preserve">{{ </w:t>
-      </w:r>
-      <w:proofErr w:type="spellStart"/>
-      <w:r>
-        <w:t>curso</w:t>
+        <w:t>{{ curso.</w:t>
+      </w:r>
+      <w:r>
+        <w:t>name</w:t>
       </w:r>
       <w:proofErr w:type="gramEnd"/>
       <w:r>
-        <w:t>.</w:t>
-      </w:r>
-      <w:proofErr w:type="gramStart"/>
-      <w:r>
-        <w:t>nombre</w:t>
-      </w:r>
-      <w:proofErr w:type="spellEnd"/>
-      <w:r>
-        <w:t xml:space="preserve"> }</w:t>
-      </w:r>
-      <w:proofErr w:type="gramEnd"/>
-      <w:r>
-        <w:t>}</w:t>
+        <w:t xml:space="preserve"> }}</w:t>
       </w:r>
     </w:p>
     <w:p>
@@ -2215,7 +2251,10 @@
       <w:proofErr w:type="spellStart"/>
       <w:proofErr w:type="gramStart"/>
       <w:r>
-        <w:t>curso.itinerarios</w:t>
+        <w:t>curso.itinera</w:t>
+      </w:r>
+      <w:r>
+        <w:t>ries</w:t>
       </w:r>
       <w:proofErr w:type="spellEnd"/>
       <w:proofErr w:type="gramEnd"/>
@@ -2247,15 +2286,14 @@
           <w:b/>
           <w:bCs/>
         </w:rPr>
-        <w:t xml:space="preserve">{{ </w:t>
-      </w:r>
-      <w:proofErr w:type="spellStart"/>
+        <w:t>{{ itinerario.</w:t>
+      </w:r>
       <w:r>
         <w:rPr>
           <w:b/>
           <w:bCs/>
         </w:rPr>
-        <w:t>itinerario</w:t>
+        <w:t>name</w:t>
       </w:r>
       <w:proofErr w:type="gramEnd"/>
       <w:r>
@@ -2263,31 +2301,7 @@
           <w:b/>
           <w:bCs/>
         </w:rPr>
-        <w:t>.</w:t>
-      </w:r>
-      <w:proofErr w:type="gramStart"/>
-      <w:r>
-        <w:rPr>
-          <w:b/>
-          <w:bCs/>
-        </w:rPr>
-        <w:t>nombre</w:t>
-      </w:r>
-      <w:proofErr w:type="spellEnd"/>
-      <w:r>
-        <w:rPr>
-          <w:b/>
-          <w:bCs/>
-        </w:rPr>
-        <w:t xml:space="preserve"> }</w:t>
-      </w:r>
-      <w:proofErr w:type="gramEnd"/>
-      <w:r>
-        <w:rPr>
-          <w:b/>
-          <w:bCs/>
-        </w:rPr>
-        <w:t>}</w:t>
+        <w:t xml:space="preserve"> }}</w:t>
       </w:r>
     </w:p>
     <w:p>
@@ -2302,14 +2316,12 @@
         </w:rPr>
         <w:t xml:space="preserve">{%p for </w:t>
       </w:r>
-      <w:proofErr w:type="spellStart"/>
-      <w:r>
-        <w:rPr>
-          <w:lang w:val="en-US"/>
-        </w:rPr>
-        <w:t>tasa</w:t>
-      </w:r>
-      <w:proofErr w:type="spellEnd"/>
+      <w:r>
+        <w:rPr>
+          <w:lang w:val="en-US"/>
+        </w:rPr>
+        <w:t>rate</w:t>
+      </w:r>
       <w:r>
         <w:rPr>
           <w:lang w:val="en-US"/>
@@ -2322,7 +2334,13 @@
         <w:rPr>
           <w:lang w:val="en-US"/>
         </w:rPr>
-        <w:t>itinerario.tasas</w:t>
+        <w:t>itinerario.</w:t>
+      </w:r>
+      <w:r>
+        <w:rPr>
+          <w:lang w:val="en-US"/>
+        </w:rPr>
+        <w:t>rates</w:t>
       </w:r>
       <w:proofErr w:type="spellEnd"/>
       <w:proofErr w:type="gramEnd"/>
@@ -2330,233 +2348,109 @@
         <w:rPr>
           <w:lang w:val="en-US"/>
         </w:rPr>
+        <w:t xml:space="preserve"> %</w:t>
+      </w:r>
+      <w:r>
+        <w:rPr>
+          <w:lang w:val="en-US"/>
+        </w:rPr>
+        <w:t>}</w:t>
+      </w:r>
+    </w:p>
+    <w:p>
+      <w:pPr>
+        <w:pStyle w:val="Ttulo4"/>
+      </w:pPr>
+      <w:proofErr w:type="gramStart"/>
+      <w:r>
+        <w:t xml:space="preserve">{{ </w:t>
+      </w:r>
+      <w:r>
+        <w:t>rate</w:t>
+      </w:r>
+      <w:r>
+        <w:t>.</w:t>
+      </w:r>
+      <w:r>
+        <w:t>name</w:t>
+      </w:r>
+      <w:proofErr w:type="gramEnd"/>
+      <w:r>
+        <w:t xml:space="preserve"> }}</w:t>
+      </w:r>
+    </w:p>
+    <w:p>
+      <w:pPr>
+        <w:jc w:val="center"/>
+      </w:pPr>
+      <w:proofErr w:type="gramStart"/>
+      <w:r>
+        <w:t xml:space="preserve">{{ </w:t>
+      </w:r>
+      <w:proofErr w:type="spellStart"/>
+      <w:r>
+        <w:t>rate</w:t>
+      </w:r>
+      <w:proofErr w:type="gramEnd"/>
+      <w:r>
+        <w:t>.</w:t>
+      </w:r>
+      <w:proofErr w:type="gramStart"/>
+      <w:r>
+        <w:t>chart</w:t>
+      </w:r>
+      <w:proofErr w:type="spellEnd"/>
+      <w:r>
+        <w:t xml:space="preserve"> }</w:t>
+      </w:r>
+      <w:proofErr w:type="gramEnd"/>
+      <w:r>
+        <w:t>}</w:t>
+      </w:r>
+      <w:proofErr w:type="spellStart"/>
+    </w:p>
+    <w:p>
+      <w:r>
+        <w:t>{%p</w:t>
+      </w:r>
+      <w:proofErr w:type="spellEnd"/>
+      <w:r>
         <w:t xml:space="preserve"> </w:t>
       </w:r>
-      <w:r>
-        <w:rPr>
-          <w:lang w:val="en-US"/>
-        </w:rPr>
-        <w:t xml:space="preserve"> %</w:t>
-      </w:r>
-      <w:r>
-        <w:rPr>
-          <w:lang w:val="en-US"/>
-        </w:rPr>
-        <w:t>}</w:t>
-      </w:r>
-    </w:p>
-    <w:p>
-      <w:pPr>
-        <w:pStyle w:val="Ttulo4"/>
-        <w:rPr>
-          <w:lang w:val="en-US"/>
-        </w:rPr>
-      </w:pPr>
-      <w:proofErr w:type="gramStart"/>
-      <w:r>
-        <w:rPr>
-          <w:lang w:val="en-US"/>
-        </w:rPr>
-        <w:t xml:space="preserve">{{ </w:t>
-      </w:r>
       <w:proofErr w:type="spellStart"/>
       <w:r>
-        <w:rPr>
-          <w:lang w:val="en-US"/>
-        </w:rPr>
-        <w:t>tasa</w:t>
-      </w:r>
-      <w:proofErr w:type="gramEnd"/>
-      <w:r>
-        <w:rPr>
-          <w:lang w:val="en-US"/>
-        </w:rPr>
-        <w:t>.</w:t>
-      </w:r>
-      <w:proofErr w:type="gramStart"/>
-      <w:r>
-        <w:rPr>
-          <w:lang w:val="en-US"/>
-        </w:rPr>
-        <w:t>nombre</w:t>
+        <w:t>endfor</w:t>
       </w:r>
       <w:proofErr w:type="spellEnd"/>
       <w:r>
-        <w:rPr>
-          <w:lang w:val="en-US"/>
-        </w:rPr>
-        <w:t xml:space="preserve"> }</w:t>
-      </w:r>
-      <w:proofErr w:type="gramEnd"/>
-      <w:r>
-        <w:rPr>
-          <w:lang w:val="en-US"/>
-        </w:rPr>
-        <w:t>}</w:t>
-      </w:r>
-    </w:p>
-    <w:p>
-      <w:pPr>
-        <w:rPr>
-          <w:lang w:val="en-US"/>
-        </w:rPr>
-      </w:pPr>
-      <w:proofErr w:type="gramStart"/>
-      <w:r>
-        <w:rPr>
-          <w:lang w:val="en-US"/>
-        </w:rPr>
-        <w:t xml:space="preserve">{{ </w:t>
+        <w:t>%}</w:t>
+      </w:r>
+    </w:p>
+    <w:p>
+      <w:pPr>
+        <w:rPr>
+          <w:lang w:val="en-US"/>
+        </w:rPr>
+      </w:pPr>
+      <w:r>
+        <w:rPr>
+          <w:lang w:val="en-US"/>
+        </w:rPr>
+        <w:t xml:space="preserve">{%p </w:t>
       </w:r>
       <w:proofErr w:type="spellStart"/>
       <w:r>
         <w:rPr>
           <w:lang w:val="en-US"/>
         </w:rPr>
-        <w:t>tasa</w:t>
-      </w:r>
-      <w:proofErr w:type="gramEnd"/>
-      <w:r>
-        <w:rPr>
-          <w:lang w:val="en-US"/>
-        </w:rPr>
-        <w:t>.</w:t>
-      </w:r>
-      <w:proofErr w:type="gramStart"/>
-      <w:r>
-        <w:rPr>
-          <w:lang w:val="en-US"/>
-        </w:rPr>
-        <w:t>grafica</w:t>
+        <w:t>endfor</w:t>
       </w:r>
       <w:proofErr w:type="spellEnd"/>
       <w:r>
         <w:rPr>
           <w:lang w:val="en-US"/>
         </w:rPr>
-        <w:t xml:space="preserve"> }</w:t>
-      </w:r>
-      <w:proofErr w:type="gramEnd"/>
-      <w:r>
-        <w:rPr>
-          <w:lang w:val="en-US"/>
-        </w:rPr>
-        <w:t>}</w:t>
-      </w:r>
-    </w:p>
-    <w:p>
-      <w:pPr>
-        <w:rPr>
-          <w:lang w:val="en-US"/>
-        </w:rPr>
-      </w:pPr>
-      <w:r>
-        <w:rPr>
-          <w:lang w:val="en-US"/>
-        </w:rPr>
-        <w:t xml:space="preserve">{%p </w:t>
-      </w:r>
-      <w:proofErr w:type="spellStart"/>
-      <w:r>
-        <w:rPr>
-          <w:lang w:val="en-US"/>
-        </w:rPr>
-        <w:t>endfor</w:t>
-      </w:r>
-      <w:proofErr w:type="spellEnd"/>
-      <w:r>
-        <w:rPr>
-          <w:lang w:val="en-US"/>
-        </w:rPr>
         <w:t>%}</w:t>
-      </w:r>
-    </w:p>
-    <w:p>
-      <w:pPr>
-        <w:rPr>
-          <w:lang w:val="en-US"/>
-        </w:rPr>
-      </w:pPr>
-      <w:r>
-        <w:rPr>
-          <w:lang w:val="en-US"/>
-        </w:rPr>
-        <w:t xml:space="preserve">{%p </w:t>
-      </w:r>
-      <w:proofErr w:type="spellStart"/>
-      <w:r>
-        <w:rPr>
-          <w:lang w:val="en-US"/>
-        </w:rPr>
-        <w:t>endfor</w:t>
-      </w:r>
-      <w:proofErr w:type="spellEnd"/>
-      <w:r>
-        <w:rPr>
-          <w:lang w:val="en-US"/>
-        </w:rPr>
-        <w:t>%}</w:t>
-      </w:r>
-    </w:p>
-    <w:p>
-      <w:pPr>
-        <w:pStyle w:val="Ttulo3"/>
-      </w:pPr>
-      <w:r>
-        <w:t xml:space="preserve">Resumen: </w:t>
-      </w:r>
-      <w:proofErr w:type="gramStart"/>
-      <w:r>
-        <w:t xml:space="preserve">{{ </w:t>
-      </w:r>
-      <w:proofErr w:type="spellStart"/>
-      <w:r>
-        <w:t>curso</w:t>
-      </w:r>
-      <w:proofErr w:type="gramEnd"/>
-      <w:r>
-        <w:t>.</w:t>
-      </w:r>
-      <w:proofErr w:type="gramStart"/>
-      <w:r>
-        <w:t>nombre</w:t>
-      </w:r>
-      <w:proofErr w:type="spellEnd"/>
-      <w:r>
-        <w:t xml:space="preserve"> }</w:t>
-      </w:r>
-      <w:proofErr w:type="gramEnd"/>
-      <w:r>
-        <w:t>}</w:t>
-      </w:r>
-    </w:p>
-    <w:p>
-      <w:pPr>
-        <w:jc w:val="both"/>
-      </w:pPr>
-      <w:proofErr w:type="gramStart"/>
-      <w:r>
-        <w:t>{{ curso</w:t>
-      </w:r>
-      <w:proofErr w:type="gramEnd"/>
-      <w:r>
-        <w:t xml:space="preserve">. </w:t>
-      </w:r>
-      <w:proofErr w:type="spellStart"/>
-      <w:r>
-        <w:t>llm_</w:t>
-      </w:r>
-      <w:proofErr w:type="gramStart"/>
-      <w:r>
-        <w:t>message</w:t>
-      </w:r>
-      <w:proofErr w:type="spellEnd"/>
-      <w:r>
-        <w:t xml:space="preserve"> }</w:t>
-      </w:r>
-      <w:proofErr w:type="gramEnd"/>
-      <w:r>
-        <w:t>}</w:t>
       </w:r>
     </w:p>
     <w:p>
@@ -2657,15 +2551,204 @@
     </w:p>
     <w:p>
       <w:pPr>
-        <w:rPr>
-          <w:lang w:val="en-US"/>
-        </w:rPr>
-      </w:pPr>
-      <w:r>
-        <w:rPr>
-          <w:lang w:val="en-US"/>
-        </w:rPr>
-        <w:t>{%p else %}</w:t>
+        <w:jc w:val="left"/>
+        <w:rPr>
+          <w:lang w:val="en-US"/>
+        </w:rPr>
+      </w:pPr>
+      <w:r>
+        <w:rPr>
+          <w:lang w:val="en-US"/>
+        </w:rPr>
+        <w:br w:type="page"/>
+      </w:r>
+    </w:p>
+    <w:p>
+      <w:pPr>
+        <w:pStyle w:val="Ttulo2"/>
+      </w:pPr>
+      <w:r>
+        <w:lastRenderedPageBreak/>
+        <w:t>Resumen de la compara</w:t>
+      </w:r>
+      <w:r>
+        <w:t>ción por itinerarios</w:t>
+      </w:r>
+    </w:p>
+    <w:p>
+      <w:pPr>
+        <w:jc w:val="center"/>
+        <w:rPr>
+          <w:lang w:val="en-US"/>
+        </w:rPr>
+      </w:pPr>
+      <w:proofErr w:type="gramStart"/>
+      <w:r>
+        <w:rPr>
+          <w:lang w:val="en-US"/>
+        </w:rPr>
+        <w:t xml:space="preserve">{{ </w:t>
+      </w:r>
+      <w:proofErr w:type="spellStart"/>
+      <w:r>
+        <w:rPr>
+          <w:lang w:val="en-US"/>
+        </w:rPr>
+        <w:t>itinerar</w:t>
+      </w:r>
+      <w:r>
+        <w:rPr>
+          <w:lang w:val="en-US"/>
+        </w:rPr>
+        <w:t>ies</w:t>
+      </w:r>
+      <w:proofErr w:type="gramEnd"/>
+      <w:r>
+        <w:rPr>
+          <w:lang w:val="en-US"/>
+        </w:rPr>
+        <w:t>_</w:t>
+      </w:r>
+      <w:proofErr w:type="gramStart"/>
+      <w:r>
+        <w:rPr>
+          <w:lang w:val="en-US"/>
+        </w:rPr>
+        <w:t>data</w:t>
+      </w:r>
+      <w:r>
+        <w:rPr>
+          <w:lang w:val="en-US"/>
+        </w:rPr>
+        <w:t>.</w:t>
+      </w:r>
+      <w:r>
+        <w:rPr>
+          <w:lang w:val="en-US"/>
+        </w:rPr>
+        <w:t>resume</w:t>
+      </w:r>
+      <w:proofErr w:type="gramEnd"/>
+      <w:r>
+        <w:rPr>
+          <w:lang w:val="en-US"/>
+        </w:rPr>
+        <w:t>_</w:t>
+      </w:r>
+      <w:proofErr w:type="gramStart"/>
+      <w:r>
+        <w:rPr>
+          <w:lang w:val="en-US"/>
+        </w:rPr>
+        <w:t>chart</w:t>
+      </w:r>
+      <w:proofErr w:type="spellEnd"/>
+      <w:r>
+        <w:rPr>
+          <w:lang w:val="en-US"/>
+        </w:rPr>
+        <w:t xml:space="preserve"> }</w:t>
+      </w:r>
+      <w:proofErr w:type="gramEnd"/>
+      <w:r>
+        <w:rPr>
+          <w:lang w:val="en-US"/>
+        </w:rPr>
+        <w:t>}</w:t>
+      </w:r>
+    </w:p>
+    <w:p>
+      <w:pPr>
+        <w:rPr>
+          <w:lang w:val="en-US"/>
+        </w:rPr>
+      </w:pPr>
+      <w:proofErr w:type="gramStart"/>
+      <w:r>
+        <w:rPr>
+          <w:lang w:val="en-US"/>
+        </w:rPr>
+        <w:t xml:space="preserve">{{ </w:t>
+      </w:r>
+      <w:proofErr w:type="spellStart"/>
+      <w:r>
+        <w:rPr>
+          <w:lang w:val="en-US"/>
+        </w:rPr>
+        <w:t>itinerar</w:t>
+      </w:r>
+      <w:r>
+        <w:rPr>
+          <w:lang w:val="en-US"/>
+        </w:rPr>
+        <w:t>ies</w:t>
+      </w:r>
+      <w:proofErr w:type="gramEnd"/>
+      <w:r>
+        <w:rPr>
+          <w:lang w:val="en-US"/>
+        </w:rPr>
+        <w:t>_</w:t>
+      </w:r>
+      <w:proofErr w:type="gramStart"/>
+      <w:r>
+        <w:rPr>
+          <w:lang w:val="en-US"/>
+        </w:rPr>
+        <w:t>data</w:t>
+      </w:r>
+      <w:r>
+        <w:rPr>
+          <w:lang w:val="en-US"/>
+        </w:rPr>
+        <w:t>.</w:t>
+      </w:r>
+      <w:r>
+        <w:rPr>
+          <w:lang w:val="en-US"/>
+        </w:rPr>
+        <w:t>resume</w:t>
+      </w:r>
+      <w:proofErr w:type="gramEnd"/>
+      <w:r>
+        <w:rPr>
+          <w:lang w:val="en-US"/>
+        </w:rPr>
+        <w:t>_</w:t>
+      </w:r>
+      <w:proofErr w:type="gramStart"/>
+      <w:r>
+        <w:rPr>
+          <w:lang w:val="en-US"/>
+        </w:rPr>
+        <w:t>text</w:t>
+      </w:r>
+      <w:proofErr w:type="spellEnd"/>
+      <w:r>
+        <w:rPr>
+          <w:lang w:val="en-US"/>
+        </w:rPr>
+        <w:t xml:space="preserve"> }</w:t>
+      </w:r>
+      <w:proofErr w:type="gramEnd"/>
+      <w:r>
+        <w:rPr>
+          <w:lang w:val="en-US"/>
+        </w:rPr>
+        <w:t>}</w:t>
+      </w:r>
+    </w:p>
+    <w:p>
+      <w:r>
+        <w:t xml:space="preserve">{%p </w:t>
+      </w:r>
+      <w:proofErr w:type="spellStart"/>
+      <w:r>
+        <w:t>else</w:t>
+      </w:r>
+      <w:proofErr w:type="spellEnd"/>
+      <w:r>
+        <w:t xml:space="preserve"> %}</w:t>
       </w:r>
     </w:p>
     <w:p>
@@ -2821,17 +2904,11 @@
       </w:r>
     </w:p>
     <w:p>
-      <w:pPr>
-        <w:jc w:val="both"/>
-      </w:pPr>
       <w:r>
         <w:t>En este apartado se desglosa el rendimiento académico de la titulación agrupando las materias según su naturaleza y función dentro del plan de estudios. Este análisis es fundamental para entender cómo se distribuye el esfuerzo del alumnado y el éxito docente en las diferentes etapas de la formación, desde la acogida en los primeros cursos hasta la culminación del grado o máster.</w:t>
       </w:r>
     </w:p>
     <w:p>
-      <w:pPr>
-        <w:jc w:val="both"/>
-      </w:pPr>
       <w:r>
         <w:t>A continuación, se presentan gráficas comparativas que permiten observar la evolución de la tasa de éxito y rendimiento, categorizadas según las siguientes tipologías:</w:t>
       </w:r>
@@ -2843,7 +2920,6 @@
           <w:ilvl w:val="0"/>
           <w:numId w:val="9"/>
         </w:numPr>
-        <w:jc w:val="both"/>
       </w:pPr>
       <w:r>
         <w:rPr>
@@ -2863,7 +2939,6 @@
           <w:ilvl w:val="0"/>
           <w:numId w:val="9"/>
         </w:numPr>
-        <w:jc w:val="both"/>
       </w:pPr>
       <w:r>
         <w:rPr>
@@ -2883,7 +2958,6 @@
           <w:ilvl w:val="0"/>
           <w:numId w:val="9"/>
         </w:numPr>
-        <w:jc w:val="both"/>
       </w:pPr>
       <w:r>
         <w:rPr>
@@ -2903,7 +2977,6 @@
           <w:ilvl w:val="0"/>
           <w:numId w:val="9"/>
         </w:numPr>
-        <w:jc w:val="both"/>
       </w:pPr>
       <w:r>
         <w:rPr>
@@ -2923,7 +2996,6 @@
           <w:ilvl w:val="0"/>
           <w:numId w:val="9"/>
         </w:numPr>
-        <w:jc w:val="both"/>
       </w:pPr>
       <w:r>
         <w:rPr>
@@ -2948,100 +3020,172 @@
       </w:r>
     </w:p>
     <w:p>
-      <w:r>
+      <w:pPr>
+        <w:rPr>
+          <w:lang w:val="en-US"/>
+        </w:rPr>
+      </w:pPr>
+      <w:r>
+        <w:rPr>
+          <w:lang w:val="en-US"/>
+        </w:rPr>
         <w:lastRenderedPageBreak/>
-        <w:t xml:space="preserve">{%p </w:t>
+        <w:t xml:space="preserve">{%p for </w:t>
       </w:r>
       <w:proofErr w:type="spellStart"/>
       <w:r>
-        <w:t>for</w:t>
+        <w:rPr>
+          <w:lang w:val="en-US"/>
+        </w:rPr>
+        <w:t>curso</w:t>
       </w:r>
       <w:proofErr w:type="spellEnd"/>
       <w:r>
+        <w:rPr>
+          <w:lang w:val="en-US"/>
+        </w:rPr>
+        <w:t xml:space="preserve"> in </w:t>
+      </w:r>
+      <w:proofErr w:type="spellStart"/>
+      <w:r>
+        <w:rPr>
+          <w:lang w:val="en-US"/>
+        </w:rPr>
+        <w:t>t</w:t>
+      </w:r>
+      <w:r>
+        <w:rPr>
+          <w:lang w:val="en-US"/>
+        </w:rPr>
+        <w:t>y</w:t>
+      </w:r>
+      <w:r>
+        <w:rPr>
+          <w:lang w:val="en-US"/>
+        </w:rPr>
+        <w:t>pologies_</w:t>
+      </w:r>
+      <w:proofErr w:type="gramStart"/>
+      <w:r>
+        <w:rPr>
+          <w:lang w:val="en-US"/>
+        </w:rPr>
+        <w:t>data.</w:t>
+      </w:r>
+      <w:r>
+        <w:rPr>
+          <w:lang w:val="en-US"/>
+        </w:rPr>
+        <w:t>breakdown</w:t>
+      </w:r>
+      <w:proofErr w:type="spellEnd"/>
+      <w:proofErr w:type="gramEnd"/>
+      <w:r>
+        <w:rPr>
+          <w:lang w:val="en-US"/>
+        </w:rPr>
         <w:t xml:space="preserve"> </w:t>
       </w:r>
       <w:r>
-        <w:t>curso</w:t>
-      </w:r>
-      <w:r>
-        <w:t xml:space="preserve"> in </w:t>
+        <w:rPr>
+          <w:lang w:val="en-US"/>
+        </w:rPr>
+        <w:t>%}</w:t>
+      </w:r>
+    </w:p>
+    <w:p>
+      <w:pPr>
+        <w:pStyle w:val="Ttulo2"/>
+        <w:rPr>
+          <w:lang w:val="en-US"/>
+        </w:rPr>
+      </w:pPr>
+      <w:r>
+        <w:rPr>
+          <w:lang w:val="en-US"/>
+        </w:rPr>
+        <w:t xml:space="preserve">CURSO: </w:t>
+      </w:r>
+      <w:proofErr w:type="gramStart"/>
+      <w:r>
+        <w:rPr>
+          <w:lang w:val="en-US"/>
+        </w:rPr>
+        <w:t>{{ curso.</w:t>
+      </w:r>
+      <w:r>
+        <w:rPr>
+          <w:lang w:val="en-US"/>
+        </w:rPr>
+        <w:t>name</w:t>
+      </w:r>
+      <w:proofErr w:type="gramEnd"/>
+      <w:r>
+        <w:rPr>
+          <w:lang w:val="en-US"/>
+        </w:rPr>
+        <w:t xml:space="preserve"> }}</w:t>
+      </w:r>
+    </w:p>
+    <w:p>
+      <w:pPr>
+        <w:rPr>
+          <w:lang w:val="en-US"/>
+        </w:rPr>
+      </w:pPr>
+      <w:r>
+        <w:rPr>
+          <w:lang w:val="en-US"/>
+        </w:rPr>
+        <w:t xml:space="preserve">{%p for </w:t>
       </w:r>
       <w:proofErr w:type="spellStart"/>
       <w:r>
-        <w:t>datos_</w:t>
-      </w:r>
-      <w:r>
+        <w:rPr>
+          <w:lang w:val="en-US"/>
+        </w:rPr>
         <w:t>tipologia</w:t>
       </w:r>
       <w:proofErr w:type="spellEnd"/>
       <w:r>
-        <w:t xml:space="preserve"> %}</w:t>
-      </w:r>
-    </w:p>
-    <w:p>
-      <w:pPr>
-        <w:pStyle w:val="Ttulo2"/>
-      </w:pPr>
-      <w:r>
-        <w:t xml:space="preserve">CURSO: </w:t>
-      </w:r>
-      <w:proofErr w:type="gramStart"/>
-      <w:r>
-        <w:t xml:space="preserve">{{ </w:t>
-      </w:r>
-      <w:proofErr w:type="spellStart"/>
-      <w:r>
-        <w:t>curso</w:t>
-      </w:r>
-      <w:proofErr w:type="gramEnd"/>
-      <w:r>
-        <w:t>.</w:t>
-      </w:r>
-      <w:proofErr w:type="gramStart"/>
-      <w:r>
-        <w:t>nombre</w:t>
-      </w:r>
-      <w:proofErr w:type="spellEnd"/>
-      <w:r>
-        <w:t xml:space="preserve"> }</w:t>
-      </w:r>
-      <w:proofErr w:type="gramEnd"/>
-      <w:r>
-        <w:t>}</w:t>
-      </w:r>
-    </w:p>
-    <w:p>
-      <w:r>
-        <w:t xml:space="preserve">{%p </w:t>
-      </w:r>
-      <w:proofErr w:type="spellStart"/>
-      <w:r>
-        <w:t>for</w:t>
-      </w:r>
-      <w:proofErr w:type="spellEnd"/>
-      <w:r>
-        <w:t xml:space="preserve"> </w:t>
-      </w:r>
-      <w:proofErr w:type="spellStart"/>
-      <w:r>
-        <w:t>tipologia</w:t>
-      </w:r>
-      <w:proofErr w:type="spellEnd"/>
-      <w:r>
+        <w:rPr>
+          <w:lang w:val="en-US"/>
+        </w:rPr>
         <w:t xml:space="preserve"> in </w:t>
       </w:r>
       <w:proofErr w:type="spellStart"/>
       <w:proofErr w:type="gramStart"/>
       <w:r>
-        <w:t>curso.tipologias</w:t>
+        <w:rPr>
+          <w:lang w:val="en-US"/>
+        </w:rPr>
+        <w:t>curso.t</w:t>
+      </w:r>
+      <w:r>
+        <w:rPr>
+          <w:lang w:val="en-US"/>
+        </w:rPr>
+        <w:t>y</w:t>
+      </w:r>
+      <w:r>
+        <w:rPr>
+          <w:lang w:val="en-US"/>
+        </w:rPr>
+        <w:t>pologi</w:t>
+      </w:r>
+      <w:r>
+        <w:rPr>
+          <w:lang w:val="en-US"/>
+        </w:rPr>
+        <w:t>es</w:t>
       </w:r>
       <w:proofErr w:type="spellEnd"/>
       <w:proofErr w:type="gramEnd"/>
       <w:r>
-        <w:t xml:space="preserve"> </w:t>
-      </w:r>
-      <w:r>
-        <w:t>%}</w:t>
+        <w:rPr>
+          <w:lang w:val="en-US"/>
+        </w:rPr>
+        <w:t xml:space="preserve"> %}</w:t>
       </w:r>
     </w:p>
     <w:p>
@@ -3050,6 +3194,7 @@
         <w:rPr>
           <w:b/>
           <w:bCs/>
+          <w:lang w:val="en-US"/>
         </w:rPr>
       </w:pPr>
       <w:proofErr w:type="spellStart"/>
@@ -3057,6 +3202,7 @@
         <w:rPr>
           <w:b/>
           <w:bCs/>
+          <w:lang w:val="en-US"/>
         </w:rPr>
         <w:t>Tipologia</w:t>
       </w:r>
@@ -3065,6 +3211,7 @@
         <w:rPr>
           <w:b/>
           <w:bCs/>
+          <w:lang w:val="en-US"/>
         </w:rPr>
         <w:t xml:space="preserve">: </w:t>
       </w:r>
@@ -3073,69 +3220,42 @@
         <w:rPr>
           <w:b/>
           <w:bCs/>
-        </w:rPr>
-        <w:t xml:space="preserve">{{ </w:t>
-      </w:r>
-      <w:proofErr w:type="spellStart"/>
+          <w:lang w:val="en-US"/>
+        </w:rPr>
+        <w:t>{{ tipolog</w:t>
+      </w:r>
       <w:r>
         <w:rPr>
           <w:b/>
           <w:bCs/>
-        </w:rPr>
-        <w:t>tipolog</w:t>
+          <w:lang w:val="en-US"/>
+        </w:rPr>
+        <w:t>i</w:t>
       </w:r>
       <w:r>
         <w:rPr>
           <w:b/>
           <w:bCs/>
-        </w:rPr>
-        <w:t>i</w:t>
+          <w:lang w:val="en-US"/>
+        </w:rPr>
+        <w:t>a.n</w:t>
       </w:r>
       <w:r>
         <w:rPr>
           <w:b/>
           <w:bCs/>
-        </w:rPr>
-        <w:t>a</w:t>
+          <w:lang w:val="en-US"/>
+        </w:rPr>
+        <w:t>ame</w:t>
       </w:r>
       <w:proofErr w:type="gramEnd"/>
       <w:r>
         <w:rPr>
           <w:b/>
           <w:bCs/>
-        </w:rPr>
-        <w:t>.</w:t>
-      </w:r>
-      <w:proofErr w:type="gramStart"/>
-      <w:r>
-        <w:rPr>
-          <w:b/>
-          <w:bCs/>
-        </w:rPr>
-        <w:t>nombre</w:t>
-      </w:r>
-      <w:proofErr w:type="spellEnd"/>
-      <w:r>
-        <w:rPr>
-          <w:b/>
-          <w:bCs/>
-        </w:rPr>
-        <w:t xml:space="preserve"> </w:t>
-      </w:r>
-      <w:r>
-        <w:rPr>
-          <w:b/>
-          <w:bCs/>
-        </w:rPr>
-        <w:t>}</w:t>
-      </w:r>
-      <w:proofErr w:type="gramEnd"/>
-      <w:r>
-        <w:rPr>
-          <w:b/>
-          <w:bCs/>
-        </w:rPr>
-        <w:t>}</w:t>
+          <w:lang w:val="en-US"/>
+        </w:rPr>
+        <w:t xml:space="preserve"> }}</w:t>
       </w:r>
     </w:p>
     <w:p>
@@ -3150,14 +3270,12 @@
         </w:rPr>
         <w:t xml:space="preserve">{%p for </w:t>
       </w:r>
-      <w:proofErr w:type="spellStart"/>
-      <w:r>
-        <w:rPr>
-          <w:lang w:val="en-US"/>
-        </w:rPr>
-        <w:t>tasa</w:t>
-      </w:r>
-      <w:proofErr w:type="spellEnd"/>
+      <w:r>
+        <w:rPr>
+          <w:lang w:val="en-US"/>
+        </w:rPr>
+        <w:t>rate</w:t>
+      </w:r>
       <w:r>
         <w:rPr>
           <w:lang w:val="en-US"/>
@@ -3170,7 +3288,13 @@
         <w:rPr>
           <w:lang w:val="en-US"/>
         </w:rPr>
-        <w:t>tipologia.tasas</w:t>
+        <w:t>tipologia.</w:t>
+      </w:r>
+      <w:r>
+        <w:rPr>
+          <w:lang w:val="en-US"/>
+        </w:rPr>
+        <w:t>rates</w:t>
       </w:r>
       <w:proofErr w:type="spellEnd"/>
       <w:proofErr w:type="gramEnd"/>
@@ -3178,106 +3302,75 @@
         <w:rPr>
           <w:lang w:val="en-US"/>
         </w:rPr>
-        <w:t xml:space="preserve">  %}</w:t>
+        <w:t xml:space="preserve"> %}</w:t>
       </w:r>
     </w:p>
     <w:p>
       <w:pPr>
         <w:pStyle w:val="Ttulo4"/>
-        <w:rPr>
-          <w:lang w:val="en-US"/>
-        </w:rPr>
       </w:pPr>
       <w:proofErr w:type="gramStart"/>
       <w:r>
-        <w:rPr>
-          <w:lang w:val="en-US"/>
-        </w:rPr>
         <w:t xml:space="preserve">{{ </w:t>
       </w:r>
+      <w:r>
+        <w:t>rate</w:t>
+      </w:r>
+      <w:r>
+        <w:t>.n</w:t>
+      </w:r>
+      <w:r>
+        <w:t>ame</w:t>
+      </w:r>
+      <w:proofErr w:type="gramEnd"/>
+      <w:r>
+        <w:t xml:space="preserve"> }}</w:t>
+      </w:r>
       <w:proofErr w:type="spellStart"/>
-      <w:r>
-        <w:rPr>
-          <w:lang w:val="en-US"/>
-        </w:rPr>
-        <w:t>tasa</w:t>
+    </w:p>
+    <w:p>
+      <w:proofErr w:type="spellEnd"/>
+      <w:proofErr w:type="gramStart"/>
+      <w:r>
+        <w:t xml:space="preserve">{{ </w:t>
+      </w:r>
+      <w:proofErr w:type="spellStart"/>
+      <w:r>
+        <w:t>rate</w:t>
       </w:r>
       <w:proofErr w:type="gramEnd"/>
       <w:r>
-        <w:rPr>
-          <w:lang w:val="en-US"/>
-        </w:rPr>
         <w:t>.</w:t>
       </w:r>
       <w:proofErr w:type="gramStart"/>
       <w:r>
-        <w:rPr>
-          <w:lang w:val="en-US"/>
-        </w:rPr>
-        <w:t>nombre</w:t>
+        <w:t>chart</w:t>
       </w:r>
       <w:proofErr w:type="spellEnd"/>
       <w:r>
-        <w:rPr>
-          <w:lang w:val="en-US"/>
-        </w:rPr>
         <w:t xml:space="preserve"> }</w:t>
       </w:r>
       <w:proofErr w:type="gramEnd"/>
       <w:r>
-        <w:rPr>
-          <w:lang w:val="en-US"/>
-        </w:rPr>
         <w:t>}</w:t>
       </w:r>
-    </w:p>
-    <w:p>
-      <w:pPr>
-        <w:rPr>
-          <w:lang w:val="en-US"/>
-        </w:rPr>
-      </w:pPr>
-      <w:proofErr w:type="gramStart"/>
-      <w:r>
-        <w:rPr>
-          <w:lang w:val="en-US"/>
-        </w:rPr>
-        <w:t xml:space="preserve">{{ </w:t>
-      </w:r>
       <w:proofErr w:type="spellStart"/>
-      <w:r>
-        <w:rPr>
-          <w:lang w:val="en-US"/>
-        </w:rPr>
-        <w:t>tasa</w:t>
-      </w:r>
-      <w:proofErr w:type="gramEnd"/>
-      <w:r>
-        <w:rPr>
-          <w:lang w:val="en-US"/>
-        </w:rPr>
-        <w:t>.</w:t>
-      </w:r>
-      <w:proofErr w:type="gramStart"/>
-      <w:r>
-        <w:rPr>
-          <w:lang w:val="en-US"/>
-        </w:rPr>
-        <w:t>grafica</w:t>
+    </w:p>
+    <w:p>
+      <w:r>
+        <w:t>{%p</w:t>
       </w:r>
       <w:proofErr w:type="spellEnd"/>
       <w:r>
-        <w:rPr>
-          <w:lang w:val="en-US"/>
-        </w:rPr>
-        <w:t xml:space="preserve"> }</w:t>
-      </w:r>
-      <w:proofErr w:type="gramEnd"/>
-      <w:r>
-        <w:rPr>
-          <w:lang w:val="en-US"/>
-        </w:rPr>
-        <w:t>}</w:t>
+        <w:t xml:space="preserve"> </w:t>
+      </w:r>
+      <w:proofErr w:type="spellStart"/>
+      <w:r>
+        <w:t>endfor</w:t>
+      </w:r>
+      <w:proofErr w:type="spellEnd"/>
+      <w:r>
+        <w:t>%}</w:t>
       </w:r>
     </w:p>
     <w:p>
@@ -3305,94 +3398,6 @@
           <w:lang w:val="en-US"/>
         </w:rPr>
         <w:t>%}</w:t>
-      </w:r>
-    </w:p>
-    <w:p>
-      <w:pPr>
-        <w:rPr>
-          <w:lang w:val="en-US"/>
-        </w:rPr>
-      </w:pPr>
-      <w:r>
-        <w:rPr>
-          <w:lang w:val="en-US"/>
-        </w:rPr>
-        <w:t xml:space="preserve">{%p </w:t>
-      </w:r>
-      <w:proofErr w:type="spellStart"/>
-      <w:r>
-        <w:rPr>
-          <w:lang w:val="en-US"/>
-        </w:rPr>
-        <w:t>endfor</w:t>
-      </w:r>
-      <w:proofErr w:type="spellEnd"/>
-      <w:r>
-        <w:rPr>
-          <w:lang w:val="en-US"/>
-        </w:rPr>
-        <w:t>%}</w:t>
-      </w:r>
-    </w:p>
-    <w:p>
-      <w:pPr>
-        <w:pStyle w:val="Ttulo3"/>
-      </w:pPr>
-      <w:r>
-        <w:t xml:space="preserve">Resumen: </w:t>
-      </w:r>
-      <w:proofErr w:type="gramStart"/>
-      <w:r>
-        <w:t xml:space="preserve">{{ </w:t>
-      </w:r>
-      <w:proofErr w:type="spellStart"/>
-      <w:r>
-        <w:t>curso</w:t>
-      </w:r>
-      <w:proofErr w:type="gramEnd"/>
-      <w:r>
-        <w:t>.</w:t>
-      </w:r>
-      <w:proofErr w:type="gramStart"/>
-      <w:r>
-        <w:t>nombre</w:t>
-      </w:r>
-      <w:proofErr w:type="spellEnd"/>
-      <w:r>
-        <w:t xml:space="preserve"> }</w:t>
-      </w:r>
-      <w:proofErr w:type="gramEnd"/>
-      <w:r>
-        <w:t>}</w:t>
-      </w:r>
-    </w:p>
-    <w:p>
-      <w:pPr>
-        <w:jc w:val="both"/>
-      </w:pPr>
-      <w:proofErr w:type="gramStart"/>
-      <w:r>
-        <w:t>{{ curso</w:t>
-      </w:r>
-      <w:proofErr w:type="gramEnd"/>
-      <w:r>
-        <w:t xml:space="preserve">. </w:t>
-      </w:r>
-      <w:proofErr w:type="spellStart"/>
-      <w:r>
-        <w:t>llm_</w:t>
-      </w:r>
-      <w:proofErr w:type="gramStart"/>
-      <w:r>
-        <w:t>message</w:t>
-      </w:r>
-      <w:proofErr w:type="spellEnd"/>
-      <w:r>
-        <w:t xml:space="preserve"> }</w:t>
-      </w:r>
-      <w:proofErr w:type="gramEnd"/>
-      <w:r>
-        <w:t>}</w:t>
       </w:r>
     </w:p>
     <w:p>
@@ -3489,6 +3494,195 @@
           <w:lang w:val="en-US"/>
         </w:rPr>
         <w:t>%}</w:t>
+      </w:r>
+    </w:p>
+    <w:p>
+      <w:pPr>
+        <w:jc w:val="left"/>
+        <w:rPr>
+          <w:lang w:val="en-US"/>
+        </w:rPr>
+      </w:pPr>
+      <w:r>
+        <w:rPr>
+          <w:lang w:val="en-US"/>
+        </w:rPr>
+        <w:br w:type="page"/>
+      </w:r>
+    </w:p>
+    <w:p>
+      <w:pPr>
+        <w:pStyle w:val="Ttulo2"/>
+      </w:pPr>
+      <w:r>
+        <w:lastRenderedPageBreak/>
+        <w:t>Resumen de comparación por ti</w:t>
+      </w:r>
+      <w:r>
+        <w:t>pología</w:t>
+      </w:r>
+    </w:p>
+    <w:p>
+      <w:pPr>
+        <w:jc w:val="center"/>
+        <w:rPr>
+          <w:lang w:val="en-US"/>
+        </w:rPr>
+      </w:pPr>
+      <w:proofErr w:type="gramStart"/>
+      <w:r>
+        <w:rPr>
+          <w:lang w:val="en-US"/>
+        </w:rPr>
+        <w:t xml:space="preserve">{{ </w:t>
+      </w:r>
+      <w:proofErr w:type="spellStart"/>
+      <w:r>
+        <w:rPr>
+          <w:lang w:val="en-US"/>
+        </w:rPr>
+        <w:t>t</w:t>
+      </w:r>
+      <w:r>
+        <w:rPr>
+          <w:lang w:val="en-US"/>
+        </w:rPr>
+        <w:t>y</w:t>
+      </w:r>
+      <w:r>
+        <w:rPr>
+          <w:lang w:val="en-US"/>
+        </w:rPr>
+        <w:t>pologies</w:t>
+      </w:r>
+      <w:proofErr w:type="gramEnd"/>
+      <w:r>
+        <w:rPr>
+          <w:lang w:val="en-US"/>
+        </w:rPr>
+        <w:t>_</w:t>
+      </w:r>
+      <w:proofErr w:type="gramStart"/>
+      <w:r>
+        <w:rPr>
+          <w:lang w:val="en-US"/>
+        </w:rPr>
+        <w:t>data</w:t>
+      </w:r>
+      <w:r>
+        <w:rPr>
+          <w:lang w:val="en-US"/>
+        </w:rPr>
+        <w:t>.resume</w:t>
+      </w:r>
+      <w:proofErr w:type="gramEnd"/>
+      <w:r>
+        <w:rPr>
+          <w:lang w:val="en-US"/>
+        </w:rPr>
+        <w:t>_</w:t>
+      </w:r>
+      <w:proofErr w:type="gramStart"/>
+      <w:r>
+        <w:rPr>
+          <w:lang w:val="en-US"/>
+        </w:rPr>
+        <w:t>chart</w:t>
+      </w:r>
+      <w:proofErr w:type="spellEnd"/>
+      <w:r>
+        <w:rPr>
+          <w:lang w:val="en-US"/>
+        </w:rPr>
+        <w:t xml:space="preserve"> }</w:t>
+      </w:r>
+      <w:proofErr w:type="gramEnd"/>
+      <w:r>
+        <w:rPr>
+          <w:lang w:val="en-US"/>
+        </w:rPr>
+        <w:t>}</w:t>
+      </w:r>
+    </w:p>
+    <w:p>
+      <w:pPr>
+        <w:rPr>
+          <w:lang w:val="en-US"/>
+        </w:rPr>
+      </w:pPr>
+      <w:proofErr w:type="gramStart"/>
+      <w:r>
+        <w:rPr>
+          <w:lang w:val="en-US"/>
+        </w:rPr>
+        <w:t xml:space="preserve">{{ </w:t>
+      </w:r>
+      <w:proofErr w:type="spellStart"/>
+      <w:r>
+        <w:rPr>
+          <w:lang w:val="en-US"/>
+        </w:rPr>
+        <w:t>t</w:t>
+      </w:r>
+      <w:r>
+        <w:rPr>
+          <w:lang w:val="en-US"/>
+        </w:rPr>
+        <w:t>y</w:t>
+      </w:r>
+      <w:r>
+        <w:rPr>
+          <w:lang w:val="en-US"/>
+        </w:rPr>
+        <w:t>pologies</w:t>
+      </w:r>
+      <w:proofErr w:type="gramEnd"/>
+      <w:r>
+        <w:rPr>
+          <w:lang w:val="en-US"/>
+        </w:rPr>
+        <w:t>_</w:t>
+      </w:r>
+      <w:proofErr w:type="gramStart"/>
+      <w:r>
+        <w:rPr>
+          <w:lang w:val="en-US"/>
+        </w:rPr>
+        <w:t>data</w:t>
+      </w:r>
+      <w:r>
+        <w:rPr>
+          <w:lang w:val="en-US"/>
+        </w:rPr>
+        <w:t>.resume</w:t>
+      </w:r>
+      <w:proofErr w:type="gramEnd"/>
+      <w:r>
+        <w:rPr>
+          <w:lang w:val="en-US"/>
+        </w:rPr>
+        <w:t>_</w:t>
+      </w:r>
+      <w:proofErr w:type="gramStart"/>
+      <w:r>
+        <w:rPr>
+          <w:lang w:val="en-US"/>
+        </w:rPr>
+        <w:t>text</w:t>
+      </w:r>
+      <w:proofErr w:type="spellEnd"/>
+      <w:r>
+        <w:rPr>
+          <w:lang w:val="en-US"/>
+        </w:rPr>
+        <w:t xml:space="preserve"> }</w:t>
+      </w:r>
+      <w:proofErr w:type="gramEnd"/>
+      <w:r>
+        <w:rPr>
+          <w:lang w:val="en-US"/>
+        </w:rPr>
+        <w:t>}</w:t>
       </w:r>
     </w:p>
     <w:p>
@@ -5264,6 +5458,10 @@
   <w:style w:type="paragraph" w:default="1" w:styleId="Normal">
     <w:name w:val="Normal"/>
     <w:qFormat/>
+    <w:rsid w:val="00886F66"/>
+    <w:pPr>
+      <w:jc w:val="both"/>
+    </w:pPr>
   </w:style>
   <w:style w:type="paragraph" w:styleId="Ttulo1">
     <w:name w:val="heading 1"/>
@@ -5319,11 +5517,12 @@
     <w:uiPriority w:val="9"/>
     <w:unhideWhenUsed/>
     <w:qFormat/>
-    <w:rsid w:val="003D4042"/>
+    <w:rsid w:val="005B28BF"/>
     <w:pPr>
       <w:keepNext/>
       <w:keepLines/>
       <w:spacing w:before="160" w:after="80"/>
+      <w:jc w:val="left"/>
       <w:outlineLvl w:val="2"/>
     </w:pPr>
     <w:rPr>
@@ -5467,7 +5666,6 @@
   <w:style w:type="character" w:default="1" w:styleId="Fuentedeprrafopredeter">
     <w:name w:val="Default Paragraph Font"/>
     <w:uiPriority w:val="1"/>
-    <w:semiHidden/>
     <w:unhideWhenUsed/>
   </w:style>
   <w:style w:type="table" w:default="1" w:styleId="Tablanormal">
@@ -5524,7 +5722,7 @@
     <w:basedOn w:val="Fuentedeprrafopredeter"/>
     <w:link w:val="Ttulo3"/>
     <w:uiPriority w:val="9"/>
-    <w:rsid w:val="003D4042"/>
+    <w:rsid w:val="005B28BF"/>
     <w:rPr>
       <w:rFonts w:eastAsiaTheme="majorEastAsia" w:cstheme="majorBidi"/>
       <w:color w:val="000000" w:themeColor="text1"/>

</xml_diff>

<commit_message>
Working with real data
</commit_message>
<xml_diff>
--- a/templates/InformePruebaV4.docx
+++ b/templates/InformePruebaV4.docx
@@ -239,17 +239,7 @@
     </w:p>
     <w:sdt>
       <w:sdtPr>
-        <w:rPr>
-          <w:rFonts w:asciiTheme="minorHAnsi" w:eastAsiaTheme="minorHAnsi" w:hAnsiTheme="minorHAnsi" w:cstheme="minorBidi"/>
-          <w:b/>
-          <w:color w:val="auto"/>
-          <w:kern w:val="2"/>
-          <w:sz w:val="22"/>
-          <w:szCs w:val="22"/>
-          <w:lang w:eastAsia="en-US"/>
-          <w14:ligatures w14:val="standardContextual"/>
-        </w:rPr>
-        <w:id w:val="1097903503"/>
+        <w:id w:val="2002844169"/>
         <w:docPartObj>
           <w:docPartGallery w:val="Table of Contents"/>
           <w:docPartUnique/>
@@ -257,8 +247,15 @@
       </w:sdtPr>
       <w:sdtEndPr>
         <w:rPr>
-          <w:bCs w:val="0"/>
+          <w:rFonts w:asciiTheme="minorHAnsi" w:eastAsiaTheme="minorHAnsi" w:hAnsiTheme="minorHAnsi" w:cstheme="minorBidi"/>
+          <w:b/>
           <w:noProof/>
+          <w:color w:val="auto"/>
+          <w:kern w:val="2"/>
+          <w:sz w:val="24"/>
+          <w:szCs w:val="24"/>
+          <w:lang w:eastAsia="en-US"/>
+          <w14:ligatures w14:val="standardContextual"/>
         </w:rPr>
       </w:sdtEndPr>
       <w:sdtContent>
@@ -288,76 +285,32 @@
           </w:pPr>
           <w:r>
             <w:rPr>
-              <w:b w:val="0"/>
-              <w:bCs w:val="0"/>
+              <w:i w:val="0"/>
+              <w:iCs w:val="0"/>
             </w:rPr>
             <w:fldChar w:fldCharType="begin"/>
           </w:r>
           <w:r>
-            <w:instrText>TOC \o "1-3" \h \z \u</w:instrText>
+            <w:rPr>
+              <w:i w:val="0"/>
+              <w:iCs w:val="0"/>
+            </w:rPr>
+            <w:instrText xml:space="preserve"> TOC \o "1-3" \n \h \z \u </w:instrText>
           </w:r>
           <w:r>
             <w:rPr>
-              <w:b w:val="0"/>
-              <w:bCs w:val="0"/>
+              <w:i w:val="0"/>
+              <w:iCs w:val="0"/>
             </w:rPr>
             <w:fldChar w:fldCharType="separate"/>
           </w:r>
-          <w:hyperlink w:anchor="_Toc222910236" w:history="1">
+          <w:hyperlink w:anchor="_Toc223266993" w:history="1">
             <w:r>
               <w:rPr>
                 <w:rStyle w:val="Hipervnculo"/>
                 <w:noProof/>
               </w:rPr>
               <w:t>Datos utilizados en el análisis</w:t>
-            </w:r>
-            <w:r>
-              <w:rPr>
-                <w:noProof/>
-                <w:webHidden/>
-              </w:rPr>
-              <w:tab/>
-            </w:r>
-            <w:r>
-              <w:rPr>
-                <w:noProof/>
-                <w:webHidden/>
-              </w:rPr>
-              <w:fldChar w:fldCharType="begin"/>
-            </w:r>
-            <w:r>
-              <w:rPr>
-                <w:noProof/>
-                <w:webHidden/>
-              </w:rPr>
-              <w:instrText xml:space="preserve"> PAGEREF _Toc222910236 \h </w:instrText>
-            </w:r>
-            <w:r>
-              <w:rPr>
-                <w:noProof/>
-                <w:webHidden/>
-              </w:rPr>
-            </w:r>
-            <w:r>
-              <w:rPr>
-                <w:noProof/>
-                <w:webHidden/>
-              </w:rPr>
-              <w:fldChar w:fldCharType="separate"/>
-            </w:r>
-            <w:r>
-              <w:rPr>
-                <w:noProof/>
-                <w:webHidden/>
-              </w:rPr>
-              <w:t>3</w:t>
-            </w:r>
-            <w:r>
-              <w:rPr>
-                <w:noProof/>
-                <w:webHidden/>
-              </w:rPr>
-              <w:fldChar w:fldCharType="end"/>
             </w:r>
           </w:hyperlink>
         </w:p>
@@ -377,61 +330,13 @@
               <w:lang w:eastAsia="es-ES_tradnl"/>
             </w:rPr>
           </w:pPr>
-          <w:hyperlink w:anchor="_Toc222910237" w:history="1">
+          <w:hyperlink w:anchor="_Toc223266994" w:history="1">
             <w:r>
               <w:rPr>
                 <w:rStyle w:val="Hipervnculo"/>
                 <w:noProof/>
               </w:rPr>
               <w:t>Introducción y objetivos</w:t>
-            </w:r>
-            <w:r>
-              <w:rPr>
-                <w:noProof/>
-                <w:webHidden/>
-              </w:rPr>
-              <w:tab/>
-            </w:r>
-            <w:r>
-              <w:rPr>
-                <w:noProof/>
-                <w:webHidden/>
-              </w:rPr>
-              <w:fldChar w:fldCharType="begin"/>
-            </w:r>
-            <w:r>
-              <w:rPr>
-                <w:noProof/>
-                <w:webHidden/>
-              </w:rPr>
-              <w:instrText xml:space="preserve"> PAGEREF _Toc222910237 \h </w:instrText>
-            </w:r>
-            <w:r>
-              <w:rPr>
-                <w:noProof/>
-                <w:webHidden/>
-              </w:rPr>
-            </w:r>
-            <w:r>
-              <w:rPr>
-                <w:noProof/>
-                <w:webHidden/>
-              </w:rPr>
-              <w:fldChar w:fldCharType="separate"/>
-            </w:r>
-            <w:r>
-              <w:rPr>
-                <w:noProof/>
-                <w:webHidden/>
-              </w:rPr>
-              <w:t>4</w:t>
-            </w:r>
-            <w:r>
-              <w:rPr>
-                <w:noProof/>
-                <w:webHidden/>
-              </w:rPr>
-              <w:fldChar w:fldCharType="end"/>
             </w:r>
           </w:hyperlink>
         </w:p>
@@ -451,7 +356,7 @@
               <w:lang w:eastAsia="es-ES_tradnl"/>
             </w:rPr>
           </w:pPr>
-          <w:hyperlink w:anchor="_Toc222910238" w:history="1">
+          <w:hyperlink w:anchor="_Toc223266995" w:history="1">
             <w:r>
               <w:rPr>
                 <w:rStyle w:val="Hipervnculo"/>
@@ -459,60 +364,247 @@
               </w:rPr>
               <w:t>Definición de indicadores</w:t>
             </w:r>
+          </w:hyperlink>
+        </w:p>
+        <w:p>
+          <w:pPr>
+            <w:pStyle w:val="TDC1"/>
+            <w:tabs>
+              <w:tab w:val="right" w:leader="dot" w:pos="8494"/>
+            </w:tabs>
+            <w:rPr>
+              <w:rFonts w:eastAsiaTheme="minorEastAsia"/>
+              <w:b w:val="0"/>
+              <w:bCs w:val="0"/>
+              <w:i w:val="0"/>
+              <w:iCs w:val="0"/>
+              <w:noProof/>
+              <w:lang w:eastAsia="es-ES_tradnl"/>
+            </w:rPr>
+          </w:pPr>
+          <w:hyperlink w:anchor="_Toc223266996" w:history="1">
             <w:r>
               <w:rPr>
+                <w:rStyle w:val="Hipervnculo"/>
                 <w:noProof/>
-                <w:webHidden/>
               </w:rPr>
-              <w:tab/>
+              <w:t>Análisis</w:t>
             </w:r>
+          </w:hyperlink>
+        </w:p>
+        <w:p>
+          <w:pPr>
+            <w:pStyle w:val="TDC1"/>
+            <w:tabs>
+              <w:tab w:val="right" w:leader="dot" w:pos="8494"/>
+            </w:tabs>
+            <w:rPr>
+              <w:rFonts w:eastAsiaTheme="minorEastAsia"/>
+              <w:b w:val="0"/>
+              <w:bCs w:val="0"/>
+              <w:i w:val="0"/>
+              <w:iCs w:val="0"/>
+              <w:noProof/>
+              <w:lang w:eastAsia="es-ES_tradnl"/>
+            </w:rPr>
+          </w:pPr>
+          <w:hyperlink w:anchor="_Toc223266997" w:history="1">
             <w:r>
               <w:rPr>
+                <w:rStyle w:val="Hipervnculo"/>
                 <w:noProof/>
-                <w:webHidden/>
               </w:rPr>
-              <w:fldChar w:fldCharType="begin"/>
-            </w:r>
-            <w:r>
-              <w:rPr>
-                <w:noProof/>
-                <w:webHidden/>
-              </w:rPr>
-              <w:instrText xml:space="preserve"> PAGEREF _Toc222910238 \h </w:instrText>
-            </w:r>
-            <w:r>
-              <w:rPr>
-                <w:noProof/>
-                <w:webHidden/>
-              </w:rPr>
-            </w:r>
-            <w:r>
-              <w:rPr>
-                <w:noProof/>
-                <w:webHidden/>
-              </w:rPr>
-              <w:fldChar w:fldCharType="separate"/>
-            </w:r>
-            <w:r>
-              <w:rPr>
-                <w:noProof/>
-                <w:webHidden/>
-              </w:rPr>
-              <w:t>4</w:t>
-            </w:r>
-            <w:r>
-              <w:rPr>
-                <w:noProof/>
-                <w:webHidden/>
-              </w:rPr>
-              <w:fldChar w:fldCharType="end"/>
+              <w:t>Desglose de asignaturas de la titulación</w:t>
             </w:r>
           </w:hyperlink>
-          <w:r>
+        </w:p>
+        <w:p>
+          <w:pPr>
+            <w:pStyle w:val="TDC2"/>
+            <w:tabs>
+              <w:tab w:val="right" w:leader="dot" w:pos="8494"/>
+            </w:tabs>
             <w:rPr>
+              <w:rFonts w:eastAsiaTheme="minorEastAsia"/>
               <w:b w:val="0"/>
               <w:bCs w:val="0"/>
               <w:noProof/>
+              <w:sz w:val="24"/>
+              <w:szCs w:val="24"/>
+              <w:lang w:eastAsia="es-ES_tradnl"/>
+            </w:rPr>
+          </w:pPr>
+          <w:hyperlink w:anchor="_Toc223267000" w:history="1">
+            <w:r>
+              <w:rPr>
+                <w:rStyle w:val="Hipervnculo"/>
+                <w:noProof/>
+              </w:rPr>
+              <w:t>Resumen del desglose de asignaturas</w:t>
+            </w:r>
+          </w:hyperlink>
+        </w:p>
+        <w:p>
+          <w:pPr>
+            <w:pStyle w:val="TDC1"/>
+            <w:tabs>
+              <w:tab w:val="right" w:leader="dot" w:pos="8494"/>
+            </w:tabs>
+            <w:rPr>
+              <w:rFonts w:eastAsiaTheme="minorEastAsia"/>
+              <w:b w:val="0"/>
+              <w:bCs w:val="0"/>
+              <w:i w:val="0"/>
+              <w:iCs w:val="0"/>
+              <w:noProof/>
+              <w:lang w:eastAsia="es-ES_tradnl"/>
+            </w:rPr>
+          </w:pPr>
+          <w:hyperlink w:anchor="_Toc223267001" w:history="1">
+            <w:r>
+              <w:rPr>
+                <w:rStyle w:val="Hipervnculo"/>
+                <w:noProof/>
+              </w:rPr>
+              <w:t>Análisis</w:t>
+            </w:r>
+          </w:hyperlink>
+        </w:p>
+        <w:p>
+          <w:pPr>
+            <w:pStyle w:val="TDC1"/>
+            <w:tabs>
+              <w:tab w:val="right" w:leader="dot" w:pos="8494"/>
+            </w:tabs>
+            <w:rPr>
+              <w:rFonts w:eastAsiaTheme="minorEastAsia"/>
+              <w:b w:val="0"/>
+              <w:bCs w:val="0"/>
+              <w:i w:val="0"/>
+              <w:iCs w:val="0"/>
+              <w:noProof/>
+              <w:lang w:eastAsia="es-ES_tradnl"/>
+            </w:rPr>
+          </w:pPr>
+          <w:hyperlink w:anchor="_Toc223267002" w:history="1">
+            <w:r>
+              <w:rPr>
+                <w:rStyle w:val="Hipervnculo"/>
+                <w:noProof/>
+              </w:rPr>
+              <w:t>Estudio y comparación de itinerarios de la titulación</w:t>
+            </w:r>
+          </w:hyperlink>
+        </w:p>
+        <w:p>
+          <w:pPr>
+            <w:pStyle w:val="TDC2"/>
+            <w:tabs>
+              <w:tab w:val="right" w:leader="dot" w:pos="8494"/>
+            </w:tabs>
+            <w:rPr>
+              <w:rFonts w:eastAsiaTheme="minorEastAsia"/>
+              <w:b w:val="0"/>
+              <w:bCs w:val="0"/>
+              <w:noProof/>
+              <w:sz w:val="24"/>
+              <w:szCs w:val="24"/>
+              <w:lang w:eastAsia="es-ES_tradnl"/>
+            </w:rPr>
+          </w:pPr>
+          <w:hyperlink w:anchor="_Toc223267005" w:history="1">
+            <w:r>
+              <w:rPr>
+                <w:rStyle w:val="Hipervnculo"/>
+                <w:noProof/>
+              </w:rPr>
+              <w:t>Resumen de la comparación por itinerarios</w:t>
+            </w:r>
+          </w:hyperlink>
+        </w:p>
+        <w:p>
+          <w:pPr>
+            <w:pStyle w:val="TDC1"/>
+            <w:tabs>
+              <w:tab w:val="right" w:leader="dot" w:pos="8494"/>
+            </w:tabs>
+            <w:rPr>
+              <w:rFonts w:eastAsiaTheme="minorEastAsia"/>
+              <w:b w:val="0"/>
+              <w:bCs w:val="0"/>
+              <w:i w:val="0"/>
+              <w:iCs w:val="0"/>
+              <w:noProof/>
+              <w:lang w:eastAsia="es-ES_tradnl"/>
+            </w:rPr>
+          </w:pPr>
+          <w:hyperlink w:anchor="_Toc223267006" w:history="1">
+            <w:r>
+              <w:rPr>
+                <w:rStyle w:val="Hipervnculo"/>
+                <w:noProof/>
+              </w:rPr>
+              <w:t>Análisis</w:t>
+            </w:r>
+          </w:hyperlink>
+        </w:p>
+        <w:p>
+          <w:pPr>
+            <w:pStyle w:val="TDC1"/>
+            <w:tabs>
+              <w:tab w:val="right" w:leader="dot" w:pos="8494"/>
+            </w:tabs>
+            <w:rPr>
+              <w:rFonts w:eastAsiaTheme="minorEastAsia"/>
+              <w:b w:val="0"/>
+              <w:bCs w:val="0"/>
+              <w:i w:val="0"/>
+              <w:iCs w:val="0"/>
+              <w:noProof/>
+              <w:lang w:eastAsia="es-ES_tradnl"/>
+            </w:rPr>
+          </w:pPr>
+          <w:hyperlink w:anchor="_Toc223267007" w:history="1">
+            <w:r>
+              <w:rPr>
+                <w:rStyle w:val="Hipervnculo"/>
+                <w:noProof/>
+              </w:rPr>
+              <w:t>Estudio y comparación por tipología de asignaturas en la titulación</w:t>
+            </w:r>
+          </w:hyperlink>
+        </w:p>
+        <w:p>
+          <w:pPr>
+            <w:pStyle w:val="TDC2"/>
+            <w:tabs>
+              <w:tab w:val="right" w:leader="dot" w:pos="8494"/>
+            </w:tabs>
+            <w:rPr>
+              <w:rFonts w:eastAsiaTheme="minorEastAsia"/>
+              <w:b w:val="0"/>
+              <w:bCs w:val="0"/>
+              <w:noProof/>
+              <w:sz w:val="24"/>
+              <w:szCs w:val="24"/>
+              <w:lang w:eastAsia="es-ES_tradnl"/>
+            </w:rPr>
+          </w:pPr>
+          <w:hyperlink w:anchor="_Toc223267010" w:history="1">
+            <w:r>
+              <w:rPr>
+                <w:rStyle w:val="Hipervnculo"/>
+                <w:noProof/>
+              </w:rPr>
+              <w:t>Resumen de comparación por tipología</w:t>
+            </w:r>
+          </w:hyperlink>
+        </w:p>
+        <w:p>
+          <w:r>
+            <w:rPr>
+              <w:i/>
+              <w:iCs/>
             </w:rPr>
             <w:fldChar w:fldCharType="end"/>
           </w:r>
@@ -550,7 +642,7 @@
         <w:pStyle w:val="Ttulo1"/>
       </w:pPr>
       <w:bookmarkStart w:id="0" w:name="_Toc222311414"/>
-      <w:bookmarkStart w:id="1" w:name="_Toc222910236"/>
+      <w:bookmarkStart w:id="1" w:name="_Toc223266993"/>
       <w:r>
         <w:lastRenderedPageBreak/>
         <w:t>Datos utilizados en el análisis</w:t>
@@ -757,9 +849,10 @@
     <w:p>
       <w:pPr>
         <w:pStyle w:val="Ttulo1"/>
+        <w:jc w:val="left"/>
       </w:pPr>
       <w:bookmarkStart w:id="2" w:name="_Toc222311415"/>
-      <w:bookmarkStart w:id="3" w:name="_Toc222910237"/>
+      <w:bookmarkStart w:id="3" w:name="_Toc223266994"/>
       <w:r>
         <w:lastRenderedPageBreak/>
         <w:t>Introducción y objetivos</w:t>
@@ -788,9 +881,10 @@
       <w:pPr>
         <w:pStyle w:val="Ttulo2"/>
         <w:ind w:firstLine="360"/>
+        <w:jc w:val="left"/>
       </w:pPr>
       <w:bookmarkStart w:id="4" w:name="_Toc222311416"/>
-      <w:bookmarkStart w:id="5" w:name="_Toc222910238"/>
+      <w:bookmarkStart w:id="5" w:name="_Toc223266995"/>
       <w:r>
         <w:t>Definición de indicadores</w:t>
       </w:r>
@@ -1073,25 +1167,26 @@
       <w:pPr>
         <w:pStyle w:val="Ttulo1"/>
       </w:pPr>
+      <w:bookmarkStart w:id="6" w:name="_Toc223266996"/>
       <w:r>
         <w:t>Análisis</w:t>
       </w:r>
-    </w:p>
-    <w:p>
-      <w:pPr>
-        <w:pStyle w:val="Ttulo1"/>
-      </w:pPr>
-    </w:p>
-    <w:p>
-      <w:pPr>
-        <w:pStyle w:val="Ttulo1"/>
-        <w:rPr>
-          <w:rFonts w:eastAsiaTheme="minorEastAsia"/>
-        </w:rPr>
-      </w:pPr>
+      <w:bookmarkStart w:id="7" w:name="_Toc223266997"/>
+      <w:bookmarkEnd w:id="6"/>
+      <w:r>
+        <w:t>:</w:t>
+      </w:r>
+      <w:r>
+        <w:br/>
+      </w:r>
+      <w:r>
+        <w:br/>
+        <w:t xml:space="preserve"> </w:t>
+      </w:r>
       <w:r>
         <w:t>Desglose de asignaturas de la titulación</w:t>
       </w:r>
+      <w:bookmarkEnd w:id="7"/>
       <w:r>
         <w:rPr>
           <w:rFonts w:eastAsiaTheme="minorEastAsia"/>
@@ -1332,23 +1427,40 @@
     <w:p>
       <w:pPr>
         <w:pStyle w:val="Ttulo2"/>
-      </w:pPr>
-      <w:bookmarkStart w:id="6" w:name="_Toc222910239"/>
-      <w:r>
+        <w:rPr>
+          <w:lang w:val="en-US"/>
+        </w:rPr>
+      </w:pPr>
+      <w:bookmarkStart w:id="8" w:name="_Toc222910239"/>
+      <w:bookmarkStart w:id="9" w:name="_Toc223266998"/>
+      <w:r>
+        <w:rPr>
+          <w:lang w:val="en-US"/>
+        </w:rPr>
         <w:t xml:space="preserve">CURSO: </w:t>
       </w:r>
       <w:proofErr w:type="gramStart"/>
       <w:r>
+        <w:rPr>
+          <w:lang w:val="en-US"/>
+        </w:rPr>
         <w:t>{{ curso.</w:t>
       </w:r>
       <w:r>
+        <w:rPr>
+          <w:lang w:val="en-US"/>
+        </w:rPr>
         <w:t>name</w:t>
       </w:r>
       <w:proofErr w:type="gramEnd"/>
       <w:r>
+        <w:rPr>
+          <w:lang w:val="en-US"/>
+        </w:rPr>
         <w:t xml:space="preserve"> }}</w:t>
       </w:r>
-      <w:bookmarkEnd w:id="6"/>
+      <w:bookmarkEnd w:id="8"/>
+      <w:bookmarkEnd w:id="9"/>
     </w:p>
     <w:p>
       <w:pPr>
@@ -1447,6 +1559,7 @@
           <w:lang w:val="en-US"/>
         </w:rPr>
       </w:pPr>
+      <w:bookmarkStart w:id="10" w:name="_Toc223266999"/>
       <w:proofErr w:type="spellStart"/>
       <w:r>
         <w:rPr>
@@ -1575,33 +1688,55 @@
         </w:rPr>
         <w:t>}</w:t>
       </w:r>
+      <w:bookmarkEnd w:id="10"/>
     </w:p>
     <w:p>
       <w:pPr>
         <w:jc w:val="center"/>
+        <w:rPr>
+          <w:lang w:val="en-US"/>
+        </w:rPr>
       </w:pPr>
       <w:proofErr w:type="gramStart"/>
       <w:r>
+        <w:rPr>
+          <w:lang w:val="en-US"/>
+        </w:rPr>
         <w:t xml:space="preserve">{{ </w:t>
       </w:r>
       <w:proofErr w:type="spellStart"/>
       <w:r>
+        <w:rPr>
+          <w:lang w:val="en-US"/>
+        </w:rPr>
         <w:t>item</w:t>
       </w:r>
       <w:proofErr w:type="gramEnd"/>
       <w:r>
+        <w:rPr>
+          <w:lang w:val="en-US"/>
+        </w:rPr>
         <w:t>.</w:t>
       </w:r>
       <w:proofErr w:type="gramStart"/>
       <w:r>
+        <w:rPr>
+          <w:lang w:val="en-US"/>
+        </w:rPr>
         <w:t>chart</w:t>
       </w:r>
       <w:proofErr w:type="spellEnd"/>
       <w:r>
+        <w:rPr>
+          <w:lang w:val="en-US"/>
+        </w:rPr>
         <w:t xml:space="preserve"> }</w:t>
       </w:r>
       <w:proofErr w:type="gramEnd"/>
       <w:r>
+        <w:rPr>
+          <w:lang w:val="en-US"/>
+        </w:rPr>
         <w:t>}</w:t>
       </w:r>
     </w:p>
@@ -1709,42 +1844,28 @@
       </w:pPr>
     </w:p>
     <w:p>
-      <w:pPr>
-        <w:rPr>
-          <w:lang w:val="en-US"/>
-        </w:rPr>
-      </w:pPr>
-      <w:r>
-        <w:rPr>
-          <w:lang w:val="en-US"/>
-        </w:rPr>
-        <w:t>{%p endif %}</w:t>
-      </w:r>
-    </w:p>
-    <w:p>
-      <w:pPr>
-        <w:rPr>
-          <w:lang w:val="en-US"/>
-        </w:rPr>
-      </w:pPr>
-      <w:r>
-        <w:rPr>
-          <w:lang w:val="en-US"/>
-        </w:rPr>
+      <w:r>
         <w:t xml:space="preserve">{%p </w:t>
       </w:r>
       <w:proofErr w:type="spellStart"/>
       <w:r>
-        <w:rPr>
-          <w:lang w:val="en-US"/>
-        </w:rPr>
+        <w:t>endif</w:t>
+      </w:r>
+      <w:proofErr w:type="spellEnd"/>
+      <w:r>
+        <w:t xml:space="preserve"> %}</w:t>
+      </w:r>
+    </w:p>
+    <w:p>
+      <w:r>
+        <w:t xml:space="preserve">{%p </w:t>
+      </w:r>
+      <w:proofErr w:type="spellStart"/>
+      <w:r>
         <w:t>endfor</w:t>
       </w:r>
       <w:proofErr w:type="spellEnd"/>
       <w:r>
-        <w:rPr>
-          <w:lang w:val="en-US"/>
-        </w:rPr>
         <w:t xml:space="preserve"> %}</w:t>
       </w:r>
     </w:p>
@@ -1767,6 +1888,7 @@
       <w:pPr>
         <w:pStyle w:val="Ttulo2"/>
       </w:pPr>
+      <w:bookmarkStart w:id="11" w:name="_Toc223267000"/>
       <w:r>
         <w:lastRenderedPageBreak/>
         <w:t>Resumen del desglose de asig</w:t>
@@ -1774,6 +1896,7 @@
       <w:r>
         <w:t>naturas</w:t>
       </w:r>
+      <w:bookmarkEnd w:id="11"/>
     </w:p>
     <w:p>
       <w:pPr>
@@ -1808,13 +1931,7 @@
         <w:rPr>
           <w:lang w:val="en-US"/>
         </w:rPr>
-        <w:t>data.</w:t>
-      </w:r>
-      <w:r>
-        <w:rPr>
-          <w:lang w:val="en-US"/>
-        </w:rPr>
-        <w:t>resume</w:t>
+        <w:t>data.resume</w:t>
       </w:r>
       <w:proofErr w:type="gramEnd"/>
       <w:r>
@@ -1909,16 +2026,16 @@
       </w:r>
     </w:p>
     <w:p>
-      <w:pPr>
-        <w:rPr>
-          <w:lang w:val="en-US"/>
-        </w:rPr>
-      </w:pPr>
-      <w:r>
-        <w:rPr>
-          <w:lang w:val="en-US"/>
-        </w:rPr>
-        <w:t>{%p else %}</w:t>
+      <w:r>
+        <w:t xml:space="preserve">{%p </w:t>
+      </w:r>
+      <w:proofErr w:type="spellStart"/>
+      <w:r>
+        <w:t>else</w:t>
+      </w:r>
+      <w:proofErr w:type="spellEnd"/>
+      <w:r>
+        <w:t xml:space="preserve"> %}</w:t>
       </w:r>
     </w:p>
     <w:p>
@@ -2010,23 +2127,40 @@
           <w:rFonts w:eastAsiaTheme="minorEastAsia"/>
         </w:rPr>
       </w:pPr>
+      <w:bookmarkStart w:id="12" w:name="_Toc223267001"/>
       <w:r>
         <w:rPr>
           <w:rFonts w:eastAsiaTheme="minorEastAsia"/>
         </w:rPr>
         <w:t>Análisis</w:t>
       </w:r>
-    </w:p>
-    <w:p>
-      <w:pPr>
-        <w:pStyle w:val="Ttulo1"/>
-      </w:pPr>
+      <w:bookmarkStart w:id="13" w:name="_Toc223267002"/>
+      <w:bookmarkEnd w:id="12"/>
       <w:r>
         <w:rPr>
           <w:rFonts w:eastAsiaTheme="minorEastAsia"/>
         </w:rPr>
+        <w:t>:</w:t>
+      </w:r>
+      <w:r>
+        <w:rPr>
+          <w:rFonts w:eastAsiaTheme="minorEastAsia"/>
+        </w:rPr>
+        <w:br/>
+      </w:r>
+      <w:r>
+        <w:rPr>
+          <w:rFonts w:eastAsiaTheme="minorEastAsia"/>
+        </w:rPr>
+        <w:br/>
+      </w:r>
+      <w:r>
+        <w:rPr>
+          <w:rFonts w:eastAsiaTheme="minorEastAsia"/>
+        </w:rPr>
         <w:t>Estudio y comparación de itinerarios de la titulación</w:t>
       </w:r>
+      <w:bookmarkEnd w:id="13"/>
       <w:r>
         <w:br w:type="page"/>
       </w:r>
@@ -2221,6 +2355,7 @@
       <w:pPr>
         <w:pStyle w:val="Ttulo2"/>
       </w:pPr>
+      <w:bookmarkStart w:id="14" w:name="_Toc223267003"/>
       <w:r>
         <w:t xml:space="preserve">CURSO: </w:t>
       </w:r>
@@ -2235,6 +2370,7 @@
       <w:r>
         <w:t xml:space="preserve"> }}</w:t>
       </w:r>
+      <w:bookmarkEnd w:id="14"/>
     </w:p>
     <w:p>
       <w:r>
@@ -2273,6 +2409,7 @@
           <w:bCs/>
         </w:rPr>
       </w:pPr>
+      <w:bookmarkStart w:id="15" w:name="_Toc223267004"/>
       <w:r>
         <w:rPr>
           <w:b/>
@@ -2303,6 +2440,7 @@
         </w:rPr>
         <w:t xml:space="preserve"> }}</w:t>
       </w:r>
+      <w:bookmarkEnd w:id="15"/>
     </w:p>
     <w:p>
       <w:pPr>
@@ -2360,69 +2498,117 @@
     <w:p>
       <w:pPr>
         <w:pStyle w:val="Ttulo4"/>
+        <w:rPr>
+          <w:lang w:val="en-US"/>
+        </w:rPr>
       </w:pPr>
       <w:proofErr w:type="gramStart"/>
       <w:r>
+        <w:rPr>
+          <w:lang w:val="en-US"/>
+        </w:rPr>
         <w:t xml:space="preserve">{{ </w:t>
       </w:r>
       <w:r>
+        <w:rPr>
+          <w:lang w:val="en-US"/>
+        </w:rPr>
         <w:t>rate</w:t>
       </w:r>
       <w:r>
+        <w:rPr>
+          <w:lang w:val="en-US"/>
+        </w:rPr>
         <w:t>.</w:t>
       </w:r>
       <w:r>
+        <w:rPr>
+          <w:lang w:val="en-US"/>
+        </w:rPr>
         <w:t>name</w:t>
       </w:r>
       <w:proofErr w:type="gramEnd"/>
       <w:r>
+        <w:rPr>
+          <w:lang w:val="en-US"/>
+        </w:rPr>
         <w:t xml:space="preserve"> }}</w:t>
       </w:r>
     </w:p>
     <w:p>
       <w:pPr>
         <w:jc w:val="center"/>
+        <w:rPr>
+          <w:lang w:val="en-US"/>
+        </w:rPr>
       </w:pPr>
       <w:proofErr w:type="gramStart"/>
       <w:r>
+        <w:rPr>
+          <w:lang w:val="en-US"/>
+        </w:rPr>
         <w:t xml:space="preserve">{{ </w:t>
       </w:r>
       <w:proofErr w:type="spellStart"/>
       <w:r>
+        <w:rPr>
+          <w:lang w:val="en-US"/>
+        </w:rPr>
         <w:t>rate</w:t>
       </w:r>
       <w:proofErr w:type="gramEnd"/>
       <w:r>
+        <w:rPr>
+          <w:lang w:val="en-US"/>
+        </w:rPr>
         <w:t>.</w:t>
       </w:r>
       <w:proofErr w:type="gramStart"/>
       <w:r>
+        <w:rPr>
+          <w:lang w:val="en-US"/>
+        </w:rPr>
         <w:t>chart</w:t>
       </w:r>
       <w:proofErr w:type="spellEnd"/>
       <w:r>
+        <w:rPr>
+          <w:lang w:val="en-US"/>
+        </w:rPr>
         <w:t xml:space="preserve"> }</w:t>
       </w:r>
       <w:proofErr w:type="gramEnd"/>
       <w:r>
+        <w:rPr>
+          <w:lang w:val="en-US"/>
+        </w:rPr>
         <w:t>}</w:t>
       </w:r>
+    </w:p>
+    <w:p>
+      <w:pPr>
+        <w:rPr>
+          <w:lang w:val="en-US"/>
+        </w:rPr>
+      </w:pPr>
+      <w:r>
+        <w:rPr>
+          <w:lang w:val="en-US"/>
+        </w:rPr>
+        <w:t xml:space="preserve">{%p </w:t>
+      </w:r>
       <w:proofErr w:type="spellStart"/>
-    </w:p>
-    <w:p>
-      <w:r>
-        <w:t>{%p</w:t>
+      <w:r>
+        <w:rPr>
+          <w:lang w:val="en-US"/>
+        </w:rPr>
+        <w:t>endfor</w:t>
       </w:r>
       <w:proofErr w:type="spellEnd"/>
       <w:r>
-        <w:t xml:space="preserve"> </w:t>
-      </w:r>
-      <w:proofErr w:type="spellStart"/>
-      <w:r>
-        <w:t>endfor</w:t>
-      </w:r>
-      <w:proofErr w:type="spellEnd"/>
-      <w:r>
+        <w:rPr>
+          <w:lang w:val="en-US"/>
+        </w:rPr>
         <w:t>%}</w:t>
       </w:r>
     </w:p>
@@ -2510,56 +2696,36 @@
       </w:pPr>
     </w:p>
     <w:p>
-      <w:pPr>
-        <w:rPr>
-          <w:lang w:val="en-US"/>
-        </w:rPr>
-      </w:pPr>
-      <w:r>
-        <w:rPr>
-          <w:lang w:val="en-US"/>
-        </w:rPr>
-        <w:t>{%p endif %}</w:t>
-      </w:r>
-    </w:p>
-    <w:p>
-      <w:pPr>
-        <w:rPr>
-          <w:lang w:val="en-US"/>
-        </w:rPr>
-      </w:pPr>
-      <w:r>
-        <w:rPr>
-          <w:lang w:val="en-US"/>
-        </w:rPr>
+      <w:r>
         <w:t xml:space="preserve">{%p </w:t>
       </w:r>
       <w:proofErr w:type="spellStart"/>
       <w:r>
-        <w:rPr>
-          <w:lang w:val="en-US"/>
-        </w:rPr>
+        <w:t>endif</w:t>
+      </w:r>
+      <w:proofErr w:type="spellEnd"/>
+      <w:r>
+        <w:t xml:space="preserve"> %}</w:t>
+      </w:r>
+    </w:p>
+    <w:p>
+      <w:r>
+        <w:t xml:space="preserve">{%p </w:t>
+      </w:r>
+      <w:proofErr w:type="spellStart"/>
+      <w:r>
         <w:t>endfor</w:t>
       </w:r>
       <w:proofErr w:type="spellEnd"/>
       <w:r>
-        <w:rPr>
-          <w:lang w:val="en-US"/>
-        </w:rPr>
         <w:t>%}</w:t>
       </w:r>
     </w:p>
     <w:p>
       <w:pPr>
         <w:jc w:val="left"/>
-        <w:rPr>
-          <w:lang w:val="en-US"/>
-        </w:rPr>
-      </w:pPr>
-      <w:r>
-        <w:rPr>
-          <w:lang w:val="en-US"/>
-        </w:rPr>
+      </w:pPr>
+      <w:r>
         <w:br w:type="page"/>
       </w:r>
     </w:p>
@@ -2567,6 +2733,7 @@
       <w:pPr>
         <w:pStyle w:val="Ttulo2"/>
       </w:pPr>
+      <w:bookmarkStart w:id="16" w:name="_Toc223267005"/>
       <w:r>
         <w:lastRenderedPageBreak/>
         <w:t>Resumen de la compara</w:t>
@@ -2574,6 +2741,7 @@
       <w:r>
         <w:t>ción por itinerarios</w:t>
       </w:r>
+      <w:bookmarkEnd w:id="16"/>
     </w:p>
     <w:p>
       <w:pPr>
@@ -2838,32 +3006,37 @@
           <w:rFonts w:eastAsiaTheme="minorEastAsia"/>
         </w:rPr>
       </w:pPr>
+      <w:bookmarkStart w:id="17" w:name="_Toc223267006"/>
       <w:r>
         <w:rPr>
           <w:rFonts w:eastAsiaTheme="minorEastAsia"/>
         </w:rPr>
         <w:t>Análisis</w:t>
       </w:r>
-    </w:p>
-    <w:p>
-      <w:pPr>
-        <w:pStyle w:val="Ttulo1"/>
+      <w:bookmarkStart w:id="18" w:name="_Toc223267007"/>
+      <w:bookmarkEnd w:id="17"/>
+      <w:r>
         <w:rPr>
           <w:rFonts w:eastAsiaTheme="minorEastAsia"/>
         </w:rPr>
-      </w:pPr>
-    </w:p>
-    <w:p>
-      <w:pPr>
-        <w:pStyle w:val="Ttulo1"/>
+        <w:t>:</w:t>
+      </w:r>
+      <w:r>
         <w:rPr>
           <w:rFonts w:eastAsiaTheme="minorEastAsia"/>
         </w:rPr>
-      </w:pPr>
+        <w:br/>
+      </w:r>
       <w:r>
         <w:rPr>
           <w:rFonts w:eastAsiaTheme="minorEastAsia"/>
         </w:rPr>
+        <w:br/>
+      </w:r>
+      <w:r>
+        <w:rPr>
+          <w:rFonts w:eastAsiaTheme="minorEastAsia"/>
+        </w:rPr>
         <w:t xml:space="preserve">Estudio y comparación </w:t>
       </w:r>
       <w:r>
@@ -2872,6 +3045,7 @@
         </w:rPr>
         <w:t>por tipología de asignaturas en la titulación</w:t>
       </w:r>
+      <w:bookmarkEnd w:id="18"/>
     </w:p>
     <w:p>
       <w:r>
@@ -3100,6 +3274,7 @@
           <w:lang w:val="en-US"/>
         </w:rPr>
       </w:pPr>
+      <w:bookmarkStart w:id="19" w:name="_Toc223267008"/>
       <w:r>
         <w:rPr>
           <w:lang w:val="en-US"/>
@@ -3126,6 +3301,7 @@
         </w:rPr>
         <w:t xml:space="preserve"> }}</w:t>
       </w:r>
+      <w:bookmarkEnd w:id="19"/>
     </w:p>
     <w:p>
       <w:pPr>
@@ -3197,6 +3373,7 @@
           <w:lang w:val="en-US"/>
         </w:rPr>
       </w:pPr>
+      <w:bookmarkStart w:id="20" w:name="_Toc223267009"/>
       <w:proofErr w:type="spellStart"/>
       <w:r>
         <w:rPr>
@@ -3257,6 +3434,7 @@
         </w:rPr>
         <w:t xml:space="preserve"> }}</w:t>
       </w:r>
+      <w:bookmarkEnd w:id="20"/>
     </w:p>
     <w:p>
       <w:pPr>
@@ -3308,68 +3486,116 @@
     <w:p>
       <w:pPr>
         <w:pStyle w:val="Ttulo4"/>
+        <w:rPr>
+          <w:lang w:val="en-US"/>
+        </w:rPr>
       </w:pPr>
       <w:proofErr w:type="gramStart"/>
       <w:r>
+        <w:rPr>
+          <w:lang w:val="en-US"/>
+        </w:rPr>
         <w:t xml:space="preserve">{{ </w:t>
       </w:r>
       <w:r>
+        <w:rPr>
+          <w:lang w:val="en-US"/>
+        </w:rPr>
         <w:t>rate</w:t>
       </w:r>
       <w:r>
+        <w:rPr>
+          <w:lang w:val="en-US"/>
+        </w:rPr>
         <w:t>.n</w:t>
       </w:r>
       <w:r>
+        <w:rPr>
+          <w:lang w:val="en-US"/>
+        </w:rPr>
         <w:t>ame</w:t>
       </w:r>
       <w:proofErr w:type="gramEnd"/>
       <w:r>
+        <w:rPr>
+          <w:lang w:val="en-US"/>
+        </w:rPr>
         <w:t xml:space="preserve"> }}</w:t>
       </w:r>
+    </w:p>
+    <w:p>
+      <w:pPr>
+        <w:rPr>
+          <w:lang w:val="en-US"/>
+        </w:rPr>
+      </w:pPr>
+      <w:proofErr w:type="gramStart"/>
+      <w:r>
+        <w:rPr>
+          <w:lang w:val="en-US"/>
+        </w:rPr>
+        <w:t xml:space="preserve">{{ </w:t>
+      </w:r>
       <w:proofErr w:type="spellStart"/>
-    </w:p>
-    <w:p>
+      <w:r>
+        <w:rPr>
+          <w:lang w:val="en-US"/>
+        </w:rPr>
+        <w:t>rate</w:t>
+      </w:r>
+      <w:proofErr w:type="gramEnd"/>
+      <w:r>
+        <w:rPr>
+          <w:lang w:val="en-US"/>
+        </w:rPr>
+        <w:t>.</w:t>
+      </w:r>
+      <w:proofErr w:type="gramStart"/>
+      <w:r>
+        <w:rPr>
+          <w:lang w:val="en-US"/>
+        </w:rPr>
+        <w:t>chart</w:t>
+      </w:r>
       <w:proofErr w:type="spellEnd"/>
-      <w:proofErr w:type="gramStart"/>
-      <w:r>
-        <w:t xml:space="preserve">{{ </w:t>
+      <w:r>
+        <w:rPr>
+          <w:lang w:val="en-US"/>
+        </w:rPr>
+        <w:t xml:space="preserve"> }</w:t>
+      </w:r>
+      <w:proofErr w:type="gramEnd"/>
+      <w:r>
+        <w:rPr>
+          <w:lang w:val="en-US"/>
+        </w:rPr>
+        <w:t>}</w:t>
+      </w:r>
+    </w:p>
+    <w:p>
+      <w:pPr>
+        <w:rPr>
+          <w:lang w:val="en-US"/>
+        </w:rPr>
+      </w:pPr>
+      <w:r>
+        <w:rPr>
+          <w:lang w:val="en-US"/>
+        </w:rPr>
+        <w:t xml:space="preserve">{%p </w:t>
       </w:r>
       <w:proofErr w:type="spellStart"/>
       <w:r>
-        <w:t>rate</w:t>
-      </w:r>
-      <w:proofErr w:type="gramEnd"/>
-      <w:r>
-        <w:t>.</w:t>
-      </w:r>
-      <w:proofErr w:type="gramStart"/>
-      <w:r>
-        <w:t>chart</w:t>
+        <w:rPr>
+          <w:lang w:val="en-US"/>
+        </w:rPr>
+        <w:t>endfor</w:t>
       </w:r>
       <w:proofErr w:type="spellEnd"/>
       <w:r>
-        <w:t xml:space="preserve"> }</w:t>
-      </w:r>
-      <w:proofErr w:type="gramEnd"/>
-      <w:r>
-        <w:t>}</w:t>
-      </w:r>
-      <w:proofErr w:type="spellStart"/>
-    </w:p>
-    <w:p>
-      <w:r>
-        <w:t>{%p</w:t>
-      </w:r>
-      <w:proofErr w:type="spellEnd"/>
-      <w:r>
-        <w:t xml:space="preserve"> </w:t>
-      </w:r>
-      <w:proofErr w:type="spellStart"/>
-      <w:r>
-        <w:t>endfor</w:t>
-      </w:r>
-      <w:proofErr w:type="spellEnd"/>
-      <w:r>
+        <w:rPr>
+          <w:lang w:val="en-US"/>
+        </w:rPr>
         <w:t>%}</w:t>
       </w:r>
     </w:p>
@@ -3457,56 +3683,36 @@
       </w:pPr>
     </w:p>
     <w:p>
-      <w:pPr>
-        <w:rPr>
-          <w:lang w:val="en-US"/>
-        </w:rPr>
-      </w:pPr>
-      <w:r>
-        <w:rPr>
-          <w:lang w:val="en-US"/>
-        </w:rPr>
-        <w:t>{%p endif %}</w:t>
-      </w:r>
-    </w:p>
-    <w:p>
-      <w:pPr>
-        <w:rPr>
-          <w:lang w:val="en-US"/>
-        </w:rPr>
-      </w:pPr>
-      <w:r>
-        <w:rPr>
-          <w:lang w:val="en-US"/>
-        </w:rPr>
+      <w:r>
         <w:t xml:space="preserve">{%p </w:t>
       </w:r>
       <w:proofErr w:type="spellStart"/>
       <w:r>
-        <w:rPr>
-          <w:lang w:val="en-US"/>
-        </w:rPr>
+        <w:t>endif</w:t>
+      </w:r>
+      <w:proofErr w:type="spellEnd"/>
+      <w:r>
+        <w:t xml:space="preserve"> %}</w:t>
+      </w:r>
+    </w:p>
+    <w:p>
+      <w:r>
+        <w:t xml:space="preserve">{%p </w:t>
+      </w:r>
+      <w:proofErr w:type="spellStart"/>
+      <w:r>
         <w:t>endfor</w:t>
       </w:r>
       <w:proofErr w:type="spellEnd"/>
       <w:r>
-        <w:rPr>
-          <w:lang w:val="en-US"/>
-        </w:rPr>
         <w:t>%}</w:t>
       </w:r>
     </w:p>
     <w:p>
       <w:pPr>
         <w:jc w:val="left"/>
-        <w:rPr>
-          <w:lang w:val="en-US"/>
-        </w:rPr>
-      </w:pPr>
-      <w:r>
-        <w:rPr>
-          <w:lang w:val="en-US"/>
-        </w:rPr>
+      </w:pPr>
+      <w:r>
         <w:br w:type="page"/>
       </w:r>
     </w:p>
@@ -3514,6 +3720,7 @@
       <w:pPr>
         <w:pStyle w:val="Ttulo2"/>
       </w:pPr>
+      <w:bookmarkStart w:id="21" w:name="_Toc223267010"/>
       <w:r>
         <w:lastRenderedPageBreak/>
         <w:t>Resumen de comparación por ti</w:t>
@@ -3521,6 +3728,7 @@
       <w:r>
         <w:t>pología</w:t>
       </w:r>
+      <w:bookmarkEnd w:id="21"/>
     </w:p>
     <w:p>
       <w:pPr>
@@ -3686,16 +3894,16 @@
       </w:r>
     </w:p>
     <w:p>
-      <w:pPr>
-        <w:rPr>
-          <w:lang w:val="en-US"/>
-        </w:rPr>
-      </w:pPr>
-      <w:r>
-        <w:rPr>
-          <w:lang w:val="en-US"/>
-        </w:rPr>
-        <w:t>{%p else %}</w:t>
+      <w:r>
+        <w:t xml:space="preserve">{%p </w:t>
+      </w:r>
+      <w:proofErr w:type="spellStart"/>
+      <w:r>
+        <w:t>else</w:t>
+      </w:r>
+      <w:proofErr w:type="spellEnd"/>
+      <w:r>
+        <w:t xml:space="preserve"> %}</w:t>
       </w:r>
     </w:p>
     <w:p>
@@ -5666,6 +5874,7 @@
   <w:style w:type="character" w:default="1" w:styleId="Fuentedeprrafopredeter">
     <w:name w:val="Default Paragraph Font"/>
     <w:uiPriority w:val="1"/>
+    <w:semiHidden/>
     <w:unhideWhenUsed/>
   </w:style>
   <w:style w:type="table" w:default="1" w:styleId="Tablanormal">
@@ -6080,6 +6289,7 @@
     <w:rsid w:val="004A7BCA"/>
     <w:pPr>
       <w:spacing w:before="120" w:after="0"/>
+      <w:jc w:val="left"/>
     </w:pPr>
     <w:rPr>
       <w:b/>
@@ -6099,6 +6309,7 @@
     <w:pPr>
       <w:spacing w:before="120" w:after="0"/>
       <w:ind w:left="240"/>
+      <w:jc w:val="left"/>
     </w:pPr>
     <w:rPr>
       <w:b/>
@@ -6118,6 +6329,7 @@
     <w:pPr>
       <w:spacing w:after="0"/>
       <w:ind w:left="480"/>
+      <w:jc w:val="left"/>
     </w:pPr>
     <w:rPr>
       <w:sz w:val="20"/>
@@ -6136,6 +6348,7 @@
     <w:pPr>
       <w:spacing w:after="0"/>
       <w:ind w:left="720"/>
+      <w:jc w:val="left"/>
     </w:pPr>
     <w:rPr>
       <w:sz w:val="20"/>
@@ -6154,6 +6367,7 @@
     <w:pPr>
       <w:spacing w:after="0"/>
       <w:ind w:left="960"/>
+      <w:jc w:val="left"/>
     </w:pPr>
     <w:rPr>
       <w:sz w:val="20"/>
@@ -6172,6 +6386,7 @@
     <w:pPr>
       <w:spacing w:after="0"/>
       <w:ind w:left="1200"/>
+      <w:jc w:val="left"/>
     </w:pPr>
     <w:rPr>
       <w:sz w:val="20"/>
@@ -6190,6 +6405,7 @@
     <w:pPr>
       <w:spacing w:after="0"/>
       <w:ind w:left="1440"/>
+      <w:jc w:val="left"/>
     </w:pPr>
     <w:rPr>
       <w:sz w:val="20"/>
@@ -6208,6 +6424,7 @@
     <w:pPr>
       <w:spacing w:after="0"/>
       <w:ind w:left="1680"/>
+      <w:jc w:val="left"/>
     </w:pPr>
     <w:rPr>
       <w:sz w:val="20"/>
@@ -6226,6 +6443,7 @@
     <w:pPr>
       <w:spacing w:after="0"/>
       <w:ind w:left="1920"/>
+      <w:jc w:val="left"/>
     </w:pPr>
     <w:rPr>
       <w:sz w:val="20"/>

</xml_diff>